<commit_message>
docs(submission): retain evidence URLs in attachment
</commit_message>
<xml_diff>
--- a/submission/henryng15-lfx-ianvs-pretest.docx
+++ b/submission/henryng15-lfx-ianvs-pretest.docx
@@ -1072,6 +1072,9 @@
         <w:t>`henryng15/ianvs-lfx-pretest`</w:t>
       </w:r>
       <w:r>
+        <w:t xml:space="preserve"> &lt;https://github.com/henryng15/ianvs-lfx-pretest&gt;</w:t>
+      </w:r>
+      <w:r>
         <w:t>.</w:t>
       </w:r>
     </w:p>
@@ -1671,6 +1674,9 @@
           <w:u w:val="single"/>
         </w:rPr>
         <w:t>`github.com/henryng15/ianvs-lfx-pretest`</w:t>
+      </w:r>
+      <w:r>
+        <w:t xml:space="preserve"> &lt;https://github.com/henryng15/ianvs-lfx-pretest&gt;</w:t>
       </w:r>
       <w:r>
         <w:t>.</w:t>
@@ -2093,6 +2099,12 @@
               </w:rPr>
               <w:t>#568</w:t>
             </w:r>
+            <w:r>
+              <w:rPr>
+                <w:sz w:val="17"/>
+              </w:rPr>
+              <w:t xml:space="preserve"> &lt;https://github.com/kubeedge/ianvs/issues/568&gt;</w:t>
+            </w:r>
           </w:p>
         </w:tc>
         <w:tc>
@@ -2209,6 +2221,12 @@
               </w:rPr>
               <w:t>#641</w:t>
             </w:r>
+            <w:r>
+              <w:rPr>
+                <w:sz w:val="17"/>
+              </w:rPr>
+              <w:t xml:space="preserve"> &lt;https://github.com/kubeedge/ianvs/issues/641&gt;</w:t>
+            </w:r>
           </w:p>
         </w:tc>
         <w:tc>
@@ -2338,6 +2356,12 @@
               </w:rPr>
               <w:t>#557</w:t>
             </w:r>
+            <w:r>
+              <w:rPr>
+                <w:sz w:val="17"/>
+              </w:rPr>
+              <w:t xml:space="preserve"> &lt;https://github.com/kubeedge/ianvs/issues/557&gt;</w:t>
+            </w:r>
           </w:p>
         </w:tc>
         <w:tc>
@@ -2446,6 +2470,12 @@
                 <w:u w:val="single"/>
               </w:rPr>
               <w:t>#597</w:t>
+            </w:r>
+            <w:r>
+              <w:rPr>
+                <w:sz w:val="17"/>
+              </w:rPr>
+              <w:t xml:space="preserve"> &lt;https://github.com/kubeedge/ianvs/issues/597&gt;</w:t>
             </w:r>
           </w:p>
         </w:tc>
@@ -2853,6 +2883,9 @@
           <w:u w:val="single"/>
         </w:rPr>
         <w:t>`henryng15/ianvs-lfx-pretest`</w:t>
+      </w:r>
+      <w:r>
+        <w:t xml:space="preserve"> &lt;https://github.com/henryng15/ianvs-lfx-pretest&gt;</w:t>
       </w:r>
       <w:r>
         <w:t>.</w:t>
@@ -2995,6 +3028,9 @@
         </w:rPr>
         <w:t>Executed terminal output — E1: __all__ census</w:t>
       </w:r>
+      <w:r>
+        <w:t xml:space="preserve"> &lt;https://raw.githubusercontent.com/henryng15/ianvs-lfx-pretest/e7685be/evidence/screenshots/shot-task1-e1.png&gt;</w:t>
+      </w:r>
     </w:p>
     <w:p>
       <w:pPr>
@@ -3096,6 +3132,9 @@
         </w:rPr>
         <w:t>Executed terminal output — E2: parse_kwargs call-site census</w:t>
       </w:r>
+      <w:r>
+        <w:t xml:space="preserve"> &lt;https://raw.githubusercontent.com/henryng15/ianvs-lfx-pretest/e7685be/evidence/screenshots/shot-task1-e2.png&gt;</w:t>
+      </w:r>
     </w:p>
     <w:p>
       <w:pPr>
@@ -4791,6 +4830,9 @@
         <w:t>#856</w:t>
       </w:r>
       <w:r>
+        <w:t xml:space="preserve"> &lt;https://github.com/kubeedge/ianvs/discussions/856&gt;</w:t>
+      </w:r>
+      <w:r>
         <w:t>,</w:t>
       </w:r>
     </w:p>
@@ -4803,6 +4845,9 @@
         <w:t>#875</w:t>
       </w:r>
       <w:r>
+        <w:t xml:space="preserve"> &lt;https://github.com/kubeedge/ianvs/discussions/875&gt;</w:t>
+      </w:r>
+      <w:r>
         <w:t xml:space="preserve"> and</w:t>
       </w:r>
     </w:p>
@@ -4813,6 +4858,9 @@
           <w:u w:val="single"/>
         </w:rPr>
         <w:t>#928</w:t>
+      </w:r>
+      <w:r>
+        <w:t xml:space="preserve"> &lt;https://github.com/kubeedge/ianvs/discussions/928&gt;</w:t>
       </w:r>
       <w:r>
         <w:t>, the earliest five days ahead of me.</w:t>
@@ -5045,6 +5093,12 @@
                 <w:u w:val="single"/>
               </w:rPr>
               <w:t>#903</w:t>
+            </w:r>
+            <w:r>
+              <w:rPr>
+                <w:sz w:val="17"/>
+              </w:rPr>
+              <w:t xml:space="preserve"> &lt;https://github.com/kubeedge/ianvs/discussions/903&gt;</w:t>
             </w:r>
             <w:r>
               <w:rPr>
@@ -5725,6 +5779,12 @@
               </w:rPr>
               <w:t>#651</w:t>
             </w:r>
+            <w:r>
+              <w:rPr>
+                <w:sz w:val="17"/>
+              </w:rPr>
+              <w:t xml:space="preserve"> &lt;https://github.com/kubeedge/ianvs/pull/651&gt;</w:t>
+            </w:r>
           </w:p>
         </w:tc>
         <w:tc>
@@ -5869,6 +5929,12 @@
               </w:rPr>
               <w:t>#642</w:t>
             </w:r>
+            <w:r>
+              <w:rPr>
+                <w:sz w:val="17"/>
+              </w:rPr>
+              <w:t xml:space="preserve"> &lt;https://github.com/kubeedge/ianvs/pull/642&gt;</w:t>
+            </w:r>
           </w:p>
         </w:tc>
         <w:tc>
@@ -6013,6 +6079,12 @@
               </w:rPr>
               <w:t>#598</w:t>
             </w:r>
+            <w:r>
+              <w:rPr>
+                <w:sz w:val="17"/>
+              </w:rPr>
+              <w:t xml:space="preserve"> &lt;https://github.com/kubeedge/ianvs/pull/598&gt;</w:t>
+            </w:r>
           </w:p>
         </w:tc>
         <w:tc>
@@ -6156,6 +6228,12 @@
                 <w:u w:val="single"/>
               </w:rPr>
               <w:t>#702</w:t>
+            </w:r>
+            <w:r>
+              <w:rPr>
+                <w:sz w:val="17"/>
+              </w:rPr>
+              <w:t xml:space="preserve"> &lt;https://github.com/kubeedge/ianvs/pull/702&gt;</w:t>
             </w:r>
           </w:p>
         </w:tc>
@@ -8118,6 +8196,9 @@
         </w:rPr>
         <w:t>Executed terminal output — R4a: PR #558 transitive-import differential</w:t>
       </w:r>
+      <w:r>
+        <w:t xml:space="preserve"> &lt;https://raw.githubusercontent.com/henryng15/ianvs-lfx-pretest/e7685be/evidence/screenshots/shot-task2-r4a.png&gt;</w:t>
+      </w:r>
     </w:p>
     <w:p>
       <w:pPr>
@@ -8778,6 +8859,9 @@
         </w:rPr>
         <w:t>Executed terminal output — R4b: PR #558 pickle-recovery differential</w:t>
       </w:r>
+      <w:r>
+        <w:t xml:space="preserve"> &lt;https://raw.githubusercontent.com/henryng15/ianvs-lfx-pretest/e7685be/evidence/screenshots/shot-task2-r4b.png&gt;</w:t>
+      </w:r>
     </w:p>
     <w:p>
       <w:pPr>
@@ -9811,6 +9895,9 @@
           <w:u w:val="single"/>
         </w:rPr>
         <w:t>watch or download the MP4</w:t>
+      </w:r>
+      <w:r>
+        <w:t xml:space="preserve"> &lt;https://github.com/henryng15/ianvs-lfx-pretest/blob/e8d3f9f5575b977ed7fd3905577b84676b24f831/evidence/videos/task2-reproduction.mp4&gt;</w:t>
       </w:r>
       <w:r>
         <w:t xml:space="preserve">. It presents the exact terminal commands and observed output for the analysed SHA, </w:t>
@@ -12485,6 +12572,9 @@
           <w:u w:val="single"/>
         </w:rPr>
         <w:t>`henryng15/ianvs-lfx-pretest`</w:t>
+      </w:r>
+      <w:r>
+        <w:t xml:space="preserve"> &lt;https://github.com/henryng15/ianvs-lfx-pretest&gt;</w:t>
       </w:r>
       <w:r>
         <w:t>.</w:t>
@@ -25107,6 +25197,12 @@
               </w:rPr>
               <w:t>#617</w:t>
             </w:r>
+            <w:r>
+              <w:rPr>
+                <w:sz w:val="17"/>
+              </w:rPr>
+              <w:t xml:space="preserve"> &lt;https://github.com/kubeedge/ianvs/pull/617&gt;</w:t>
+            </w:r>
           </w:p>
         </w:tc>
         <w:tc>
@@ -25225,6 +25321,12 @@
               </w:rPr>
               <w:t>#569</w:t>
             </w:r>
+            <w:r>
+              <w:rPr>
+                <w:sz w:val="17"/>
+              </w:rPr>
+              <w:t xml:space="preserve"> &lt;https://github.com/kubeedge/ianvs/pull/569&gt;</w:t>
+            </w:r>
           </w:p>
         </w:tc>
         <w:tc>
@@ -25335,6 +25437,12 @@
               </w:rPr>
               <w:t>#739</w:t>
             </w:r>
+            <w:r>
+              <w:rPr>
+                <w:sz w:val="17"/>
+              </w:rPr>
+              <w:t xml:space="preserve"> &lt;https://github.com/kubeedge/ianvs/pull/739&gt;</w:t>
+            </w:r>
           </w:p>
         </w:tc>
         <w:tc>
@@ -25446,6 +25554,12 @@
               </w:rPr>
               <w:t>#632</w:t>
             </w:r>
+            <w:r>
+              <w:rPr>
+                <w:sz w:val="17"/>
+              </w:rPr>
+              <w:t xml:space="preserve"> &lt;https://github.com/kubeedge/ianvs/pull/632&gt;</w:t>
+            </w:r>
           </w:p>
         </w:tc>
         <w:tc>
@@ -25556,6 +25670,12 @@
                 <w:u w:val="single"/>
               </w:rPr>
               <w:t>#540</w:t>
+            </w:r>
+            <w:r>
+              <w:rPr>
+                <w:sz w:val="17"/>
+              </w:rPr>
+              <w:t xml:space="preserve"> &lt;https://github.com/kubeedge/ianvs/pull/540&gt;</w:t>
             </w:r>
           </w:p>
         </w:tc>

</xml_diff>

<commit_message>
docs(evidence): render continuous Task 2 terminal walkthrough
</commit_message>
<xml_diff>
--- a/submission/henryng15-lfx-ianvs-pretest.docx
+++ b/submission/henryng15-lfx-ianvs-pretest.docx
@@ -9884,7 +9884,7 @@
         <w:rPr>
           <w:b/>
         </w:rPr>
-        <w:t>Terminal evidence video (1:42, no audio):</w:t>
+        <w:t>Terminal evidence video (0:34, no audio):</w:t>
       </w:r>
       <w:r>
         <w:t xml:space="preserve"> </w:t>
@@ -9897,10 +9897,10 @@
         <w:t>watch or download the MP4</w:t>
       </w:r>
       <w:r>
-        <w:t xml:space="preserve"> &lt;https://github.com/henryng15/ianvs-lfx-pretest/blob/e8d3f9f5575b977ed7fd3905577b84676b24f831/evidence/videos/task2-reproduction.mp4&gt;</w:t>
-      </w:r>
-      <w:r>
-        <w:t xml:space="preserve">. It presents the exact terminal commands and observed output for the analysed SHA, </w:t>
+        <w:t xml:space="preserve"> &lt;https://github.com/henryng15/ianvs-lfx-pretest/blob/main/evidence/videos/task2-reproduction.mp4&gt;</w:t>
+      </w:r>
+      <w:r>
+        <w:t xml:space="preserve">. A continuous terminal walkthrough types each command and scrolls through its preserved observed output for the analysed SHA, </w:t>
       </w:r>
       <w:r>
         <w:rPr>
@@ -9910,7 +9910,17 @@
         <w:t>pr-558</w:t>
       </w:r>
       <w:r>
-        <w:t>, R4a, R4b, and the Ianvs runtime probe.</w:t>
+        <w:t xml:space="preserve">, R4a, R4b, and the Ianvs runtime probe. The original full outputs remain in </w:t>
+      </w:r>
+      <w:r>
+        <w:rPr>
+          <w:rFonts w:ascii="Consolas" w:hAnsi="Consolas"/>
+          <w:sz w:val="18"/>
+        </w:rPr>
+        <w:t>evidence/*.txt</w:t>
+      </w:r>
+      <w:r>
+        <w:t>.</w:t>
       </w:r>
     </w:p>
     <w:p>

</xml_diff>

<commit_message>
docs(evidence): slow Task 2 terminal walkthrough
</commit_message>
<xml_diff>
--- a/submission/henryng15-lfx-ianvs-pretest.docx
+++ b/submission/henryng15-lfx-ianvs-pretest.docx
@@ -9884,7 +9884,7 @@
         <w:rPr>
           <w:b/>
         </w:rPr>
-        <w:t>Terminal evidence video (0:34, no audio):</w:t>
+        <w:t>Terminal evidence video (1:10, no audio):</w:t>
       </w:r>
       <w:r>
         <w:t xml:space="preserve"> </w:t>
@@ -9900,7 +9900,7 @@
         <w:t xml:space="preserve"> &lt;https://github.com/henryng15/ianvs-lfx-pretest/blob/main/evidence/videos/task2-reproduction.mp4&gt;</w:t>
       </w:r>
       <w:r>
-        <w:t xml:space="preserve">. A continuous terminal walkthrough types each command and scrolls through its preserved observed output for the analysed SHA, </w:t>
+        <w:t xml:space="preserve">. A continuous terminal walkthrough types each command at a readable pace and scrolls through its preserved observed output for the analysed SHA, </w:t>
       </w:r>
       <w:r>
         <w:rPr>
@@ -9910,7 +9910,7 @@
         <w:t>pr-558</w:t>
       </w:r>
       <w:r>
-        <w:t xml:space="preserve">, R4a, R4b, and the Ianvs runtime probe. The original full outputs remain in </w:t>
+        <w:t xml:space="preserve">, R4a, R4b, and the Ianvs runtime probe. The diagnostic errors shown are expected evidence, not a failed submission; the original full outputs remain in </w:t>
       </w:r>
       <w:r>
         <w:rPr>

</xml_diff>

<commit_message>
docs(evidence): replace Task 2 replay with live VS Code recording
</commit_message>
<xml_diff>
--- a/submission/henryng15-lfx-ianvs-pretest.docx
+++ b/submission/henryng15-lfx-ianvs-pretest.docx
@@ -9884,7 +9884,7 @@
         <w:rPr>
           <w:b/>
         </w:rPr>
-        <w:t>Terminal evidence video (1:10, no audio):</w:t>
+        <w:t>Live VS Code terminal recording (1:07, no audio):</w:t>
       </w:r>
       <w:r>
         <w:t xml:space="preserve"> </w:t>
@@ -9900,7 +9900,7 @@
         <w:t xml:space="preserve"> &lt;https://github.com/henryng15/ianvs-lfx-pretest/blob/main/evidence/videos/task2-reproduction.mp4&gt;</w:t>
       </w:r>
       <w:r>
-        <w:t xml:space="preserve">. A continuous VS Code-style terminal walkthrough types each command at a readable pace and scrolls through its preserved observed output for the analysed SHA, </w:t>
+        <w:t xml:space="preserve">. This is a capture of an automated demo in a real VS Code Integrated Terminal: commands are typed at a readable pace and the probes execute against the analysed SHA, </w:t>
       </w:r>
       <w:r>
         <w:rPr>
@@ -9910,7 +9910,7 @@
         <w:t>pr-558</w:t>
       </w:r>
       <w:r>
-        <w:t xml:space="preserve">, R4a, R4b, and the Ianvs runtime probe. The diagnostic errors shown are expected evidence, not a failed submission; the original full outputs remain in </w:t>
+        <w:t xml:space="preserve">, R4a, R4b, and the Ianvs runtime. The diagnostic errors shown are expected evidence, not a failed submission; the original full outputs remain in </w:t>
       </w:r>
       <w:r>
         <w:rPr>

</xml_diff>

<commit_message>
docs(evidence): humanize live Task 2 terminal recording
</commit_message>
<xml_diff>
--- a/submission/henryng15-lfx-ianvs-pretest.docx
+++ b/submission/henryng15-lfx-ianvs-pretest.docx
@@ -9884,7 +9884,7 @@
         <w:rPr>
           <w:b/>
         </w:rPr>
-        <w:t>Live VS Code terminal recording (1:07, no audio):</w:t>
+        <w:t>Live VS Code terminal recording (1:39, no audio):</w:t>
       </w:r>
       <w:r>
         <w:t xml:space="preserve"> </w:t>
@@ -9900,7 +9900,7 @@
         <w:t xml:space="preserve"> &lt;https://github.com/henryng15/ianvs-lfx-pretest/blob/main/evidence/videos/task2-reproduction.mp4&gt;</w:t>
       </w:r>
       <w:r>
-        <w:t xml:space="preserve">. This is a capture of an automated demo in a real VS Code Integrated Terminal: commands are typed at a readable pace and the probes execute against the analysed SHA, </w:t>
+        <w:t xml:space="preserve">. This is a capture of an automated demo in a real VS Code Integrated Terminal: command entry has natural pauses and brief corrections, and the probes execute against the analysed SHA, </w:t>
       </w:r>
       <w:r>
         <w:rPr>

</xml_diff>

<commit_message>
docs(submission): use single hyphens in rendered prose
</commit_message>
<xml_diff>
--- a/submission/henryng15-lfx-ianvs-pretest.docx
+++ b/submission/henryng15-lfx-ianvs-pretest.docx
@@ -7,7 +7,7 @@
         <w:pStyle w:val="Title"/>
       </w:pPr>
       <w:r>
-        <w:t>LFX Mentorship 2026 Term 3 — Pre-test Submission</w:t>
+        <w:t>LFX Mentorship 2026 Term 3 - Pre-test Submission</w:t>
       </w:r>
     </w:p>
     <w:p>
@@ -15,7 +15,7 @@
         <w:pStyle w:val="Heading2"/>
       </w:pPr>
       <w:r>
-        <w:t>CNCF / KubeEdge — Comprehensive Example Restoration for KubeEdge Ianvs: Phase IV</w:t>
+        <w:t>CNCF / KubeEdge - Comprehensive Example Restoration for KubeEdge Ianvs: Phase IV</w:t>
       </w:r>
     </w:p>
     <w:p>
@@ -563,7 +563,7 @@
     </w:p>
     <w:p>
       <w:r>
-        <w:t>Three name declarations. One is fatal, one is silently dead, one is authoritative —</w:t>
+        <w:t>Three name declarations. One is fatal, one is silently dead, one is authoritative -</w:t>
       </w:r>
     </w:p>
     <w:p>
@@ -661,7 +661,7 @@
         <w:rPr>
           <w:i/>
         </w:rPr>
-        <w:t xml:space="preserve">function signatures). Core resolves exactly one of those — the </w:t>
+        <w:t xml:space="preserve">function signatures). Core resolves exactly one of those - the </w:t>
       </w:r>
       <w:r>
         <w:rPr>
@@ -700,7 +700,7 @@
         <w:rPr>
           <w:i/>
         </w:rPr>
-        <w:t xml:space="preserve"> alias — validates none of them, and does so only when a</w:t>
+        <w:t xml:space="preserve"> alias - validates none of them, and does so only when a</w:t>
       </w:r>
     </w:p>
     <w:p>
@@ -732,7 +732,7 @@
     </w:p>
     <w:p>
       <w:r>
-        <w:t>quantifies, reproduces, and traces into five open PRs — **three of which do not change</w:t>
+        <w:t>quantifies, reproduces, and traces into five open PRs - **three of which do not change</w:t>
       </w:r>
     </w:p>
     <w:p>
@@ -832,7 +832,7 @@
               <w:rPr>
                 <w:sz w:val="17"/>
               </w:rPr>
-              <w:t>Task 1 — Root Problem Analysis</w:t>
+              <w:t>Task 1 - Root Problem Analysis</w:t>
             </w:r>
           </w:p>
         </w:tc>
@@ -876,7 +876,7 @@
               <w:rPr>
                 <w:sz w:val="17"/>
               </w:rPr>
-              <w:t>Task 2 — Multi-PR Code Review</w:t>
+              <w:t>Task 2 - Multi-PR Code Review</w:t>
             </w:r>
           </w:p>
         </w:tc>
@@ -920,7 +920,7 @@
               <w:rPr>
                 <w:sz w:val="17"/>
               </w:rPr>
-              <w:t>Task 3 — Repair Boundary Analysis</w:t>
+              <w:t>Task 3 - Repair Boundary Analysis</w:t>
             </w:r>
           </w:p>
         </w:tc>
@@ -964,7 +964,7 @@
               <w:rPr>
                 <w:sz w:val="17"/>
               </w:rPr>
-              <w:t>Task 4 — Restoration Path Design</w:t>
+              <w:t>Task 4 - Restoration Path Design</w:t>
             </w:r>
           </w:p>
         </w:tc>
@@ -1008,7 +1008,7 @@
               <w:rPr>
                 <w:sz w:val="17"/>
               </w:rPr>
-              <w:t>Bonus — Supplementary Review Coverage</w:t>
+              <w:t>Bonus - Supplementary Review Coverage</w:t>
             </w:r>
           </w:p>
         </w:tc>
@@ -1604,7 +1604,7 @@
         <w:t>robot-cityscapes-synthia</w:t>
       </w:r>
       <w:r>
-        <w:t xml:space="preserve"> cannot be run at all — its </w:t>
+        <w:t xml:space="preserve"> cannot be run at all - its </w:t>
       </w:r>
       <w:r>
         <w:rPr>
@@ -1659,7 +1659,7 @@
         <w:pStyle w:val="Heading2"/>
       </w:pPr>
       <w:r>
-        <w:t>Appendix — self-contained reproductions</w:t>
+        <w:t>Appendix - self-contained reproductions</w:t>
       </w:r>
     </w:p>
     <w:p>
@@ -1717,7 +1717,7 @@
         <w:pStyle w:val="Heading3"/>
       </w:pPr>
       <w:r>
-        <w:t>A1 — `__all__` is not read by Ianvs (Task 1 E1, Task 2 R2)</w:t>
+        <w:t>A1 - `__all__` is not read by Ianvs (Task 1 E1, Task 2 R2)</w:t>
       </w:r>
     </w:p>
     <w:p>
@@ -1793,7 +1793,7 @@
         <w:pStyle w:val="Heading3"/>
       </w:pPr>
       <w:r>
-        <w:t>A2 — PR #558 removes pickle recoverability (Task 2 R4b)</w:t>
+        <w:t>A2 - PR #558 removes pickle recoverability (Task 2 R4b)</w:t>
       </w:r>
     </w:p>
     <w:p>
@@ -1931,7 +1931,7 @@
         <w:pStyle w:val="Heading1"/>
       </w:pPr>
       <w:r>
-        <w:t>Task 1 — Root Problem Analysis</w:t>
+        <w:t>Task 1 - Root Problem Analysis</w:t>
       </w:r>
     </w:p>
     <w:p>
@@ -2187,7 +2187,7 @@
               <w:rPr>
                 <w:sz w:val="17"/>
               </w:rPr>
-              <w:t xml:space="preserve">, which is defined nowhere — hard </w:t>
+              <w:t xml:space="preserve">, which is defined nowhere - hard </w:t>
             </w:r>
             <w:r>
               <w:rPr>
@@ -2641,7 +2641,7 @@
     </w:p>
     <w:p>
       <w:r>
-        <w:t>tell which is which — because the framework gives no signal either way.</w:t>
+        <w:t>tell which is which - because the framework gives no signal either way.</w:t>
       </w:r>
     </w:p>
     <w:p>
@@ -2688,7 +2688,7 @@
         <w:t>`cloud-edge-collaborative-inference-for-llm`</w:t>
       </w:r>
       <w:r>
-        <w:t xml:space="preserve"> — query-routing algorithms; </w:t>
+        <w:t xml:space="preserve"> - query-routing algorithms; </w:t>
       </w:r>
       <w:r>
         <w:rPr>
@@ -2724,7 +2724,7 @@
         <w:t>`Cloud_Robotics/cloud-edge-collaborative-inference_bench`</w:t>
       </w:r>
       <w:r>
-        <w:t xml:space="preserve"> — perception-reasoning;</w:t>
+        <w:t xml:space="preserve"> - perception-reasoning;</w:t>
       </w:r>
     </w:p>
     <w:p>
@@ -2835,7 +2835,7 @@
         <w:t>`robot`</w:t>
       </w:r>
       <w:r>
-        <w:t xml:space="preserve"> — all carry malformed </w:t>
+        <w:t xml:space="preserve"> - all carry malformed </w:t>
       </w:r>
       <w:r>
         <w:rPr>
@@ -2902,7 +2902,7 @@
         <w:t>unmodified</w:t>
       </w:r>
       <w:r>
-        <w:t xml:space="preserve"> production helper — no stubs, no monkey-patching.</w:t>
+        <w:t xml:space="preserve"> production helper - no stubs, no monkey-patching.</w:t>
       </w:r>
     </w:p>
     <w:p>
@@ -2910,7 +2910,7 @@
         <w:pStyle w:val="Heading3"/>
       </w:pPr>
       <w:r>
-        <w:t>E1 — `__all__` is declared 134 times, malformed 30 times, and load-bearing 0 times</w:t>
+        <w:t>E1 - `__all__` is declared 134 times, malformed 30 times, and load-bearing 0 times</w:t>
       </w:r>
     </w:p>
     <w:p>
@@ -3026,7 +3026,7 @@
           <w:color w:val="155AB0"/>
           <w:u w:val="single"/>
         </w:rPr>
-        <w:t>Executed terminal output — E1: __all__ census</w:t>
+        <w:t>Executed terminal output - E1: __all__ census</w:t>
       </w:r>
       <w:r>
         <w:t xml:space="preserve"> &lt;https://raw.githubusercontent.com/henryng15/ianvs-lfx-pretest/e7685be/evidence/screenshots/shot-task1-e1.png&gt;</w:t>
@@ -3037,7 +3037,7 @@
         <w:pStyle w:val="Heading3"/>
       </w:pPr>
       <w:r>
-        <w:t>E2 — `parse_kwargs` is defined once and called never</w:t>
+        <w:t>E2 - `parse_kwargs` is defined once and called never</w:t>
       </w:r>
     </w:p>
     <w:p>
@@ -3097,7 +3097,7 @@
     </w:p>
     <w:p>
       <w:r>
-        <w:t>The defect #597 reports is real — confirmed by execution. Its blast radius is zero.</w:t>
+        <w:t>The defect #597 reports is real - confirmed by execution. Its blast radius is zero.</w:t>
       </w:r>
     </w:p>
     <w:p>
@@ -3130,7 +3130,7 @@
           <w:color w:val="155AB0"/>
           <w:u w:val="single"/>
         </w:rPr>
-        <w:t>Executed terminal output — E2: parse_kwargs call-site census</w:t>
+        <w:t>Executed terminal output - E2: parse_kwargs call-site census</w:t>
       </w:r>
       <w:r>
         <w:t xml:space="preserve"> &lt;https://raw.githubusercontent.com/henryng15/ianvs-lfx-pretest/e7685be/evidence/screenshots/shot-task1-e2.png&gt;</w:t>
@@ -3141,7 +3141,7 @@
         <w:pStyle w:val="Heading3"/>
       </w:pPr>
       <w:r>
-        <w:t>E3 — the loader collision is reproducible on production code</w:t>
+        <w:t>E3 - the loader collision is reproducible on production code</w:t>
       </w:r>
     </w:p>
     <w:p>
@@ -3562,7 +3562,7 @@
         <w:pStyle w:val="Heading3"/>
       </w:pPr>
       <w:r>
-        <w:t>E4 — 31 of 87 testenv metric declarations cannot resolve</w:t>
+        <w:t>E4 - 31 of 87 testenv metric declarations cannot resolve</w:t>
       </w:r>
     </w:p>
     <w:p>
@@ -3948,12 +3948,12 @@
         <w:t>0</w:t>
       </w:r>
       <w:r>
-        <w:t>. The half of the contract that Core resolves is intact. The half nothing checks —</w:t>
-      </w:r>
-    </w:p>
-    <w:p>
-      <w:r>
-        <w:t>the path — is broken 36 % of the time. That asymmetry *is* the root problem, measured.</w:t>
+        <w:t>. The half of the contract that Core resolves is intact. The half nothing checks -</w:t>
+      </w:r>
+    </w:p>
+    <w:p>
+      <w:r>
+        <w:t>the path - is broken 36 % of the time. That asymmetry *is* the root problem, measured.</w:t>
       </w:r>
     </w:p>
     <w:p>
@@ -3985,7 +3985,7 @@
     </w:p>
     <w:p>
       <w:r>
-        <w:t xml:space="preserve">functions — </w:t>
+        <w:t xml:space="preserve">functions - </w:t>
       </w:r>
       <w:r>
         <w:rPr>
@@ -4275,7 +4275,7 @@
               <w:rPr>
                 <w:sz w:val="17"/>
               </w:rPr>
-              <w:t xml:space="preserve"> — Example cannot start</w:t>
+              <w:t xml:space="preserve"> - Example cannot start</w:t>
             </w:r>
           </w:p>
         </w:tc>
@@ -4475,7 +4475,7 @@
               <w:rPr>
                 <w:sz w:val="17"/>
               </w:rPr>
-              <w:t>none — inert</w:t>
+              <w:t>none - inert</w:t>
             </w:r>
           </w:p>
         </w:tc>
@@ -4568,7 +4568,7 @@
               <w:rPr>
                 <w:sz w:val="17"/>
               </w:rPr>
-              <w:t>none — inert</w:t>
+              <w:t>none - inert</w:t>
             </w:r>
           </w:p>
         </w:tc>
@@ -4587,7 +4587,7 @@
     </w:p>
     <w:p>
       <w:r>
-        <w:t>the mistake — it is whether the declaration happens to lie on the resolution path.</w:t>
+        <w:t>the mistake - it is whether the declaration happens to lie on the resolution path.</w:t>
       </w:r>
     </w:p>
     <w:p>
@@ -4658,7 +4658,7 @@
     </w:p>
     <w:p>
       <w:r>
-        <w:t xml:space="preserve">  — and </w:t>
+        <w:t xml:space="preserve">  - and </w:t>
       </w:r>
       <w:r>
         <w:rPr>
@@ -5333,12 +5333,12 @@
     <w:p/>
     <w:p>
       <w:r>
-        <w:t>The strongest single new item is in Task 2 — a demonstrated regression in #558 that none</w:t>
-      </w:r>
-    </w:p>
-    <w:p>
-      <w:r>
-        <w:t>of its three existing reviewers found — and it is stated there rather than duplicated here.</w:t>
+        <w:t>The strongest single new item is in Task 2 - a demonstrated regression in #558 that none</w:t>
+      </w:r>
+    </w:p>
+    <w:p>
+      <w:r>
+        <w:t>of its three existing reviewers found - and it is stated there rather than duplicated here.</w:t>
       </w:r>
     </w:p>
     <w:p>
@@ -5377,7 +5377,7 @@
         <w:pStyle w:val="Heading1"/>
       </w:pPr>
       <w:r>
-        <w:t>Task 2 — Multi-PR Code Review</w:t>
+        <w:t>Task 2 - Multi-PR Code Review</w:t>
       </w:r>
     </w:p>
     <w:p>
@@ -5752,7 +5752,7 @@
               <w:rPr>
                 <w:sz w:val="17"/>
               </w:rPr>
-              <w:t>Repairs module identity — the *only* PR in the set that touches the live resolution path</w:t>
+              <w:t>Repairs module identity - the *only* PR in the set that touches the live resolution path</w:t>
             </w:r>
           </w:p>
         </w:tc>
@@ -5902,7 +5902,7 @@
               <w:rPr>
                 <w:sz w:val="17"/>
               </w:rPr>
-              <w:t xml:space="preserve"> in 18 modules — the declared, unresolved surface</w:t>
+              <w:t xml:space="preserve"> in 18 modules - the declared, unresolved surface</w:t>
             </w:r>
           </w:p>
         </w:tc>
@@ -6052,7 +6052,7 @@
               <w:rPr>
                 <w:sz w:val="17"/>
               </w:rPr>
-              <w:t xml:space="preserve"> for issue #641 — same surface, different Example</w:t>
+              <w:t xml:space="preserve"> for issue #641 - same surface, different Example</w:t>
             </w:r>
           </w:p>
         </w:tc>
@@ -6352,7 +6352,7 @@
               <w:rPr>
                 <w:sz w:val="17"/>
               </w:rPr>
-              <w:t xml:space="preserve"> (#597) — independently</w:t>
+              <w:t xml:space="preserve"> (#597) - independently</w:t>
             </w:r>
           </w:p>
         </w:tc>
@@ -6447,7 +6447,7 @@
     </w:p>
     <w:p>
       <w:r>
-        <w:t>falsifiable pattern —</w:t>
+        <w:t>falsifiable pattern -</w:t>
       </w:r>
     </w:p>
     <w:p>
@@ -6826,7 +6826,7 @@
               <w:rPr>
                 <w:sz w:val="17"/>
               </w:rPr>
-              <w:t>Same — correct change, incorrect rationale</w:t>
+              <w:t>Same - correct change, incorrect rationale</w:t>
             </w:r>
           </w:p>
         </w:tc>
@@ -7044,7 +7044,7 @@
         <w:rPr>
           <w:i/>
         </w:rPr>
-        <w:t>unrelated loader fix. There is no root problem — only a healthy repository receiving</w:t>
+        <w:t>unrelated loader fix. There is no root problem - only a healthy repository receiving</w:t>
       </w:r>
     </w:p>
     <w:p>
@@ -7131,7 +7131,7 @@
         <w:t>load_module()</w:t>
       </w:r>
       <w:r>
-        <w:t xml:space="preserve"> — one function, on the path — holds</w:t>
+        <w:t xml:space="preserve"> - one function, on the path - holds</w:t>
       </w:r>
     </w:p>
     <w:p>
@@ -7200,7 +7200,7 @@
         <w:t>How far the alternative survives.</w:t>
       </w:r>
       <w:r>
-        <w:t xml:space="preserve"> It survives for *#651 and #642 individually* —</w:t>
+        <w:t xml:space="preserve"> It survives for *#651 and #642 individually* -</w:t>
       </w:r>
     </w:p>
     <w:p>
@@ -7245,7 +7245,7 @@
         <w:pStyle w:val="Heading3"/>
       </w:pPr>
       <w:r>
-        <w:t>R1 — Do these PRs resolve the Root Problem? Do they fix only the symptom?</w:t>
+        <w:t>R1 - Do these PRs resolve the Root Problem? Do they fix only the symptom?</w:t>
       </w:r>
     </w:p>
     <w:tbl>
@@ -7369,7 +7369,7 @@
               <w:rPr>
                 <w:sz w:val="17"/>
               </w:rPr>
-              <w:t>Partially — fixes *direct* module identity, not the contract</w:t>
+              <w:t>Partially - fixes *direct* module identity, not the contract</w:t>
             </w:r>
           </w:p>
         </w:tc>
@@ -7532,7 +7532,7 @@
         <w:pStyle w:val="Heading3"/>
       </w:pPr>
       <w:r>
-        <w:t>R2 — `__all__` is not read by anything (applies to #651 and #642) — **new finding**</w:t>
+        <w:t>R2 - `__all__` is not read by anything (applies to #651 and #642) - **new finding**</w:t>
       </w:r>
     </w:p>
     <w:p>
@@ -7625,7 +7625,7 @@
     </w:p>
     <w:p>
       <w:r>
-        <w:t>and it is why the code is worth fixing — but **no module in the repository star-imports</w:t>
+        <w:t>and it is why the code is worth fixing - but **no module in the repository star-imports</w:t>
       </w:r>
     </w:p>
     <w:p>
@@ -7750,7 +7750,7 @@
         <w:pStyle w:val="Heading3"/>
       </w:pPr>
       <w:r>
-        <w:t>R3 — `parse_kwargs` is unreachable (applies to #598 and #702) — **new finding**</w:t>
+        <w:t>R3 - `parse_kwargs` is unreachable (applies to #598 and #702) - **new finding**</w:t>
       </w:r>
     </w:p>
     <w:p>
@@ -7833,7 +7833,7 @@
     </w:p>
     <w:p>
       <w:r>
-        <w:t>whichever merges should note the helper is currently unused — otherwise the next reader</w:t>
+        <w:t>whichever merges should note the helper is currently unused - otherwise the next reader</w:t>
       </w:r>
     </w:p>
     <w:p>
@@ -7891,7 +7891,7 @@
         <w:pStyle w:val="Heading3"/>
       </w:pPr>
       <w:r>
-        <w:t>R4 — #558: two defects not raised in the three existing reviews</w:t>
+        <w:t>R4 - #558: two defects not raised in the three existing reviews</w:t>
       </w:r>
     </w:p>
     <w:p>
@@ -7939,7 +7939,7 @@
         <w:pStyle w:val="Heading4"/>
       </w:pPr>
       <w:r>
-        <w:t>R4a — the fix does not extend to transitive imports  *(raised as a concern, never demonstrated)*</w:t>
+        <w:t>R4a - the fix does not extend to transitive imports  *(raised as a concern, never demonstrated)*</w:t>
       </w:r>
     </w:p>
     <w:p>
@@ -7954,7 +7954,7 @@
     </w:p>
     <w:p>
       <w:r>
-        <w:t>demonstrable. Fixture mirrors the repository's real shape — two Examples, each with its</w:t>
+        <w:t>demonstrable. Fixture mirrors the repository's real shape - two Examples, each with its</w:t>
       </w:r>
     </w:p>
     <w:p>
@@ -8052,7 +8052,7 @@
         <w:t>basemodel</w:t>
       </w:r>
       <w:r>
-        <w:t xml:space="preserve"> now loads correctly — that is the PR working. But it still</w:t>
+        <w:t xml:space="preserve"> now loads correctly - that is the PR working. But it still</w:t>
       </w:r>
     </w:p>
     <w:p>
@@ -8172,7 +8172,7 @@
     </w:p>
     <w:p>
       <w:r>
-        <w:t>all — visibly broken to anyone who looks. Under #558 it executes and returns a plausible</w:t>
+        <w:t>all - visibly broken to anyone who looks. Under #558 it executes and returns a plausible</w:t>
       </w:r>
     </w:p>
     <w:p>
@@ -8194,7 +8194,7 @@
           <w:color w:val="155AB0"/>
           <w:u w:val="single"/>
         </w:rPr>
-        <w:t>Executed terminal output — R4a: PR #558 transitive-import differential</w:t>
+        <w:t>Executed terminal output - R4a: PR #558 transitive-import differential</w:t>
       </w:r>
       <w:r>
         <w:t xml:space="preserve"> &lt;https://raw.githubusercontent.com/henryng15/ianvs-lfx-pretest/e7685be/evidence/screenshots/shot-task2-r4a.png&gt;</w:t>
@@ -8205,7 +8205,7 @@
         <w:pStyle w:val="Heading4"/>
       </w:pPr>
       <w:r>
-        <w:t>R4b — the PR silently changes what a pickled Example class can be recovered from  *(not raised by anyone)*</w:t>
+        <w:t>R4b - the PR silently changes what a pickled Example class can be recovered from  *(not raised by anyone)*</w:t>
       </w:r>
     </w:p>
     <w:p>
@@ -8452,7 +8452,7 @@
         <w:rPr>
           <w:b/>
         </w:rPr>
-        <w:t>Why it does not fire today — verified, not assumed.</w:t>
+        <w:t>Why it does not fire today - verified, not assumed.</w:t>
       </w:r>
       <w:r>
         <w:t xml:space="preserve"> I traced what actually reaches</w:t>
@@ -8574,7 +8574,7 @@
     </w:p>
     <w:p>
       <w:r>
-        <w:t xml:space="preserve">  — </w:t>
+        <w:t xml:space="preserve">  - </w:t>
       </w:r>
       <w:r>
         <w:rPr>
@@ -8857,7 +8857,7 @@
           <w:color w:val="155AB0"/>
           <w:u w:val="single"/>
         </w:rPr>
-        <w:t>Executed terminal output — R4b: PR #558 pickle-recovery differential</w:t>
+        <w:t>Executed terminal output - R4b: PR #558 pickle-recovery differential</w:t>
       </w:r>
       <w:r>
         <w:t xml:space="preserve"> &lt;https://raw.githubusercontent.com/henryng15/ianvs-lfx-pretest/e7685be/evidence/screenshots/shot-task2-r4b.png&gt;</w:t>
@@ -8868,7 +8868,7 @@
         <w:pStyle w:val="Heading3"/>
       </w:pPr>
       <w:r>
-        <w:t>R5 — Duplicated, conflicting and inconsistent changes across the set</w:t>
+        <w:t>R5 - Duplicated, conflicting and inconsistent changes across the set</w:t>
       </w:r>
     </w:p>
     <w:tbl>
@@ -9193,7 +9193,7 @@
     </w:p>
     <w:p>
       <w:r>
-        <w:t xml:space="preserve">#729, #759, #806 — six, counting both </w:t>
+        <w:t xml:space="preserve">#729, #759, #806 - six, counting both </w:t>
       </w:r>
       <w:r>
         <w:rPr>
@@ -9221,7 +9221,7 @@
         <w:pStyle w:val="Heading3"/>
       </w:pPr>
       <w:r>
-        <w:t>R6 — Edge cases, regression risk, cross-Example impact</w:t>
+        <w:t>R6 - Edge cases, regression risk, cross-Example impact</w:t>
       </w:r>
     </w:p>
     <w:tbl>
@@ -9374,7 +9374,7 @@
               <w:rPr>
                 <w:sz w:val="17"/>
               </w:rPr>
-              <w:t xml:space="preserve"> — R4a, demonstrated</w:t>
+              <w:t xml:space="preserve"> - R4a, demonstrated</w:t>
             </w:r>
           </w:p>
         </w:tc>
@@ -9447,7 +9447,7 @@
               <w:rPr>
                 <w:sz w:val="17"/>
               </w:rPr>
-              <w:t xml:space="preserve"> — R4b. Not triggered by any shipped Example (verified); becomes unrecoverable-by-design for any Example that puts its own class in </w:t>
+              <w:t xml:space="preserve"> - R4b. Not triggered by any shipped Example (verified); becomes unrecoverable-by-design for any Example that puts its own class in </w:t>
             </w:r>
             <w:r>
               <w:rPr>
@@ -9526,7 +9526,7 @@
               <w:rPr>
                 <w:sz w:val="17"/>
               </w:rPr>
-              <w:t>High — six PRs, one file</w:t>
+              <w:t>High - six PRs, one file</w:t>
             </w:r>
           </w:p>
         </w:tc>
@@ -9598,7 +9598,7 @@
               <w:rPr>
                 <w:sz w:val="17"/>
               </w:rPr>
-              <w:t xml:space="preserve"> — the changed declaration is not read (R2)</w:t>
+              <w:t xml:space="preserve"> - the changed declaration is not read (R2)</w:t>
             </w:r>
           </w:p>
         </w:tc>
@@ -9670,7 +9670,7 @@
               <w:rPr>
                 <w:sz w:val="17"/>
               </w:rPr>
-              <w:t xml:space="preserve"> — the changed function is not called (R3)</w:t>
+              <w:t xml:space="preserve"> - the changed function is not called (R3)</w:t>
             </w:r>
           </w:p>
         </w:tc>
@@ -9692,7 +9692,7 @@
         <w:pStyle w:val="Heading3"/>
       </w:pPr>
       <w:r>
-        <w:t>R7 — Should the changes move layer?</w:t>
+        <w:t>R7 - Should the changes move layer?</w:t>
       </w:r>
     </w:p>
     <w:p>
@@ -9728,7 +9728,7 @@
         <w:t>#598/#702: already Core, and that is where the deeper question sits</w:t>
       </w:r>
       <w:r>
-        <w:t xml:space="preserve"> — whether</w:t>
+        <w:t xml:space="preserve"> - whether</w:t>
       </w:r>
     </w:p>
     <w:p>
@@ -9764,7 +9764,7 @@
         <w:pStyle w:val="Heading3"/>
       </w:pPr>
       <w:r>
-        <w:t>R8 — Merging several of these at once</w:t>
+        <w:t>R8 - Merging several of these at once</w:t>
       </w:r>
     </w:p>
     <w:p>
@@ -9868,7 +9868,7 @@
     </w:p>
     <w:p>
       <w:r>
-        <w:t xml:space="preserve">  release note rather than a blocker — but it should be written.</w:t>
+        <w:t xml:space="preserve">  release note rather than a blocker - but it should be written.</w:t>
       </w:r>
     </w:p>
     <w:p>
@@ -9996,7 +9996,7 @@
         <w:rPr>
           <w:b/>
         </w:rPr>
-        <w:t>Also executed — a real Ianvs install and CLI run (added 2026-08-28).</w:t>
+        <w:t>Also executed - a real Ianvs install and CLI run (added 2026-08-28).</w:t>
       </w:r>
       <w:r>
         <w:t xml:space="preserve"> I installed the</w:t>
@@ -10086,7 +10086,7 @@
     </w:p>
     <w:p>
       <w:r>
-        <w:t xml:space="preserve">This run corrected a claim I had made from static reading — Core validates </w:t>
+        <w:t xml:space="preserve">This run corrected a claim I had made from static reading - Core validates </w:t>
       </w:r>
       <w:r>
         <w:rPr>
@@ -10098,7 +10098,7 @@
     </w:p>
     <w:p>
       <w:r>
-        <w:t>loudly rather than silently — and the correction is recorded in the Bonus, Task 3 and Task</w:t>
+        <w:t>loudly rather than silently - and the correction is recorded in the Bonus, Task 3 and Task</w:t>
       </w:r>
     </w:p>
     <w:p>
@@ -10146,7 +10146,7 @@
     </w:p>
     <w:p>
       <w:r>
-        <w:t>Example — every run above terminates at a configuration or dataset error rather than</w:t>
+        <w:t>Example - every run above terminates at a configuration or dataset error rather than</w:t>
       </w:r>
     </w:p>
     <w:p>
@@ -10401,7 +10401,7 @@
               <w:rPr>
                 <w:sz w:val="17"/>
               </w:rPr>
-              <w:t xml:space="preserve">Blocked before any dataset by issue #568 itself — </w:t>
+              <w:t xml:space="preserve">Blocked before any dataset by issue #568 itself - </w:t>
             </w:r>
             <w:r>
               <w:rPr>
@@ -10639,7 +10639,7 @@
               <w:rPr>
                 <w:sz w:val="17"/>
               </w:rPr>
-              <w:t xml:space="preserve"> — credited, taken as established</w:t>
+              <w:t xml:space="preserve"> - credited, taken as established</w:t>
             </w:r>
           </w:p>
         </w:tc>
@@ -10718,7 +10718,7 @@
               <w:rPr>
                 <w:sz w:val="17"/>
               </w:rPr>
-              <w:t xml:space="preserve"> — credited</w:t>
+              <w:t xml:space="preserve"> - credited</w:t>
             </w:r>
           </w:p>
         </w:tc>
@@ -10790,7 +10790,7 @@
               <w:rPr>
                 <w:sz w:val="17"/>
               </w:rPr>
-              <w:t xml:space="preserve"> — credited</w:t>
+              <w:t xml:space="preserve"> - credited</w:t>
             </w:r>
           </w:p>
         </w:tc>
@@ -10862,7 +10862,7 @@
               <w:rPr>
                 <w:sz w:val="17"/>
               </w:rPr>
-              <w:t xml:space="preserve"> — credited</w:t>
+              <w:t xml:space="preserve"> - credited</w:t>
             </w:r>
           </w:p>
         </w:tc>
@@ -10935,7 +10935,7 @@
               <w:rPr>
                 <w:sz w:val="17"/>
               </w:rPr>
-              <w:t xml:space="preserve"> — demonstrated, with the wrong-value consequence</w:t>
+              <w:t xml:space="preserve"> - demonstrated, with the wrong-value consequence</w:t>
             </w:r>
           </w:p>
         </w:tc>
@@ -11009,7 +11009,7 @@
               <w:rPr>
                 <w:sz w:val="17"/>
               </w:rPr>
-              <w:t xml:space="preserve"> — differential test; scoped honestly as latent</w:t>
+              <w:t xml:space="preserve"> - differential test; scoped honestly as latent</w:t>
             </w:r>
           </w:p>
         </w:tc>
@@ -11219,7 +11219,7 @@
         <w:pStyle w:val="Heading1"/>
       </w:pPr>
       <w:r>
-        <w:t>Task 3 — Repair Boundary Analysis</w:t>
+        <w:t>Task 3 - Repair Boundary Analysis</w:t>
       </w:r>
     </w:p>
     <w:p>
@@ -11456,7 +11456,7 @@
               <w:rPr>
                 <w:sz w:val="17"/>
               </w:rPr>
-              <w:t>all (0 broken today — see E4)</w:t>
+              <w:t>all (0 broken today - see E4)</w:t>
             </w:r>
           </w:p>
         </w:tc>
@@ -11849,7 +11849,7 @@
               <w:rPr>
                 <w:sz w:val="17"/>
               </w:rPr>
-              <w:t xml:space="preserve">0 — </w:t>
+              <w:t xml:space="preserve">0 - </w:t>
             </w:r>
             <w:r>
               <w:rPr>
@@ -11998,7 +11998,7 @@
     </w:p>
     <w:p>
       <w:r>
-        <w:t>The consequences of getting it wrong are not hypothetical — both are already visible in</w:t>
+        <w:t>The consequences of getting it wrong are not hypothetical - both are already visible in</w:t>
       </w:r>
     </w:p>
     <w:p>
@@ -13248,7 +13248,7 @@
     </w:p>
     <w:p>
       <w:r>
-        <w:t>If the defects were Example-local, the two columns would fail at similar rates — each</w:t>
+        <w:t>If the defects were Example-local, the two columns would fail at similar rates - each</w:t>
       </w:r>
     </w:p>
     <w:p>
@@ -13301,7 +13301,7 @@
         <w:rPr>
           <w:i/>
         </w:rPr>
-        <w:t>make validation possible — and explicitly *not* at the Example-local or shared-utility</w:t>
+        <w:t>make validation possible - and explicitly *not* at the Example-local or shared-utility</w:t>
       </w:r>
     </w:p>
     <w:p>
@@ -13464,7 +13464,7 @@
               <w:rPr>
                 <w:sz w:val="17"/>
               </w:rPr>
-              <w:t>Cannot reach E4 (module identity is Core). For E1/E2 it is *effective but pointless* — the changed declaration is not read. It is where the effort is going today, and it is producing #598/#702 and #729/#759/#806.</w:t>
+              <w:t>Cannot reach E4 (module identity is Core). For E1/E2 it is *effective but pointless* - the changed declaration is not read. It is where the effort is going today, and it is producing #598/#702 and #729/#759/#806.</w:t>
             </w:r>
           </w:p>
         </w:tc>
@@ -13531,7 +13531,7 @@
               <w:rPr>
                 <w:sz w:val="17"/>
               </w:rPr>
-              <w:t xml:space="preserve">The classic answer — extract a shared </w:t>
+              <w:t xml:space="preserve">The classic answer - extract a shared </w:t>
             </w:r>
             <w:r>
               <w:rPr>
@@ -13544,7 +13544,7 @@
               <w:rPr>
                 <w:sz w:val="17"/>
               </w:rPr>
-              <w:t xml:space="preserve"> helper — fails a specific test: </w:t>
+              <w:t xml:space="preserve"> helper - fails a specific test: </w:t>
             </w:r>
             <w:r>
               <w:rPr>
@@ -13616,7 +13616,7 @@
                 <w:b/>
                 <w:sz w:val="17"/>
               </w:rPr>
-              <w:t>partial — narrow scope only</w:t>
+              <w:t>partial - narrow scope only</w:t>
             </w:r>
           </w:p>
         </w:tc>
@@ -13717,7 +13717,7 @@
               <w:rPr>
                 <w:sz w:val="17"/>
               </w:rPr>
-              <w:t xml:space="preserve"> a run reaches the module — which is the actual defect. It converts silent drift into a failing check, is inert for behaviour, and needs no Example to opt in.</w:t>
+              <w:t xml:space="preserve"> a run reaches the module - which is the actual defect. It converts silent drift into a failing check, is inert for behaviour, and needs no Example to opt in.</w:t>
             </w:r>
           </w:p>
         </w:tc>
@@ -14073,7 +14073,7 @@
               <w:rPr>
                 <w:sz w:val="17"/>
               </w:rPr>
-              <w:t xml:space="preserve"> — drift resumes immediately</w:t>
+              <w:t xml:space="preserve"> - drift resumes immediately</w:t>
             </w:r>
           </w:p>
         </w:tc>
@@ -14094,7 +14094,7 @@
               <w:rPr>
                 <w:sz w:val="17"/>
               </w:rPr>
-              <w:t>high — two resolution paths coexist</w:t>
+              <w:t>high - two resolution paths coexist</w:t>
             </w:r>
           </w:p>
         </w:tc>
@@ -14229,7 +14229,7 @@
               <w:rPr>
                 <w:sz w:val="17"/>
               </w:rPr>
-              <w:t xml:space="preserve"> — E5, 572 modules</w:t>
+              <w:t xml:space="preserve"> - E5, 572 modules</w:t>
             </w:r>
           </w:p>
         </w:tc>
@@ -14257,7 +14257,7 @@
               <w:rPr>
                 <w:sz w:val="17"/>
               </w:rPr>
-              <w:t xml:space="preserve"> — no runtime path changes</w:t>
+              <w:t xml:space="preserve"> - no runtime path changes</w:t>
             </w:r>
           </w:p>
         </w:tc>
@@ -14505,7 +14505,7 @@
     </w:p>
     <w:p>
       <w:r>
-        <w:t>but to contributors — false positives that block unrelated PRs.</w:t>
+        <w:t>but to contributors - false positives that block unrelated PRs.</w:t>
       </w:r>
     </w:p>
     <w:tbl>
@@ -14835,7 +14835,7 @@
               <w:rPr>
                 <w:sz w:val="17"/>
               </w:rPr>
-              <w:t xml:space="preserve">would be a false positive if made blocking — nothing reads </w:t>
+              <w:t xml:space="preserve">would be a false positive if made blocking - nothing reads </w:t>
             </w:r>
             <w:r>
               <w:rPr>
@@ -14964,7 +14964,7 @@
               <w:rPr>
                 <w:sz w:val="17"/>
               </w:rPr>
-              <w:t>untouched — validation is static</w:t>
+              <w:t>untouched - validation is static</w:t>
             </w:r>
           </w:p>
         </w:tc>
@@ -15025,7 +15025,7 @@
         <w:rPr>
           <w:b/>
         </w:rPr>
-        <w:t>Step 1 — Core, ~30 lines: make the contract inspectable without enforcing it.</w:t>
+        <w:t>Step 1 - Core, ~30 lines: make the contract inspectable without enforcing it.</w:t>
       </w:r>
     </w:p>
     <w:p>
@@ -15087,7 +15087,7 @@
         <w:rPr>
           <w:b/>
         </w:rPr>
-        <w:t>Step 2 — CI: a static job over `examples/</w:t>
+        <w:t>Step 2 - CI: a static job over `examples/</w:t>
       </w:r>
       <w:r>
         <w:t>`.**</w:t>
@@ -15120,7 +15120,7 @@
     </w:p>
     <w:p>
       <w:r>
-        <w:t>with no matching registration, and — advisory — basename collisions and malformed</w:t>
+        <w:t>with no matching registration, and - advisory - basename collisions and malformed</w:t>
       </w:r>
     </w:p>
     <w:p>
@@ -15140,7 +15140,7 @@
         <w:rPr>
           <w:b/>
         </w:rPr>
-        <w:t>Step 3 — Core, only now: specify module identity, then change it.</w:t>
+        <w:t>Step 3 - Core, only now: specify module identity, then change it.</w:t>
       </w:r>
     </w:p>
     <w:p>
@@ -15227,7 +15227,7 @@
         <w:t>__all__</w:t>
       </w:r>
       <w:r>
-        <w:t xml:space="preserve"> and per-Example metric modules stay Example-local — they are Example</w:t>
+        <w:t xml:space="preserve"> and per-Example metric modules stay Example-local - they are Example</w:t>
       </w:r>
     </w:p>
     <w:p>
@@ -15287,7 +15287,7 @@
     </w:p>
     <w:p>
       <w:r>
-        <w:t>Discussions — and the intuitive one — is that a duplicated concern should be lifted into</w:t>
+        <w:t>Discussions - and the intuitive one - is that a duplicated concern should be lifted into</w:t>
       </w:r>
     </w:p>
     <w:p>
@@ -15375,7 +15375,7 @@
     </w:p>
     <w:p>
       <w:r>
-        <w:t>addition — a resolver that reports what *would* be resolved without importing anything —</w:t>
+        <w:t>addition - a resolver that reports what *would* be resolved without importing anything -</w:t>
       </w:r>
     </w:p>
     <w:p>
@@ -15401,7 +15401,7 @@
         <w:t>Not claimed:</w:t>
       </w:r>
       <w:r>
-        <w:t xml:space="preserve"> that CI validation is generally desirable, or that #851/#744 exist —</w:t>
+        <w:t xml:space="preserve"> that CI validation is generally desirable, or that #851/#744 exist -</w:t>
       </w:r>
     </w:p>
     <w:p>
@@ -15422,7 +15422,7 @@
         <w:pStyle w:val="Heading2"/>
       </w:pPr>
       <w:r>
-        <w:t>Correction — posted 2026-08-28</w:t>
+        <w:t>Correction - posted 2026-08-28</w:t>
       </w:r>
     </w:p>
     <w:p>
@@ -15481,7 +15481,7 @@
     </w:p>
     <w:p>
       <w:r>
-        <w:t>PR #771 — the merge commit I have been analysing throughout — and is wired into</w:t>
+        <w:t>PR #771 - the merge commit I have been analysing throughout - and is wired into</w:t>
       </w:r>
     </w:p>
     <w:p>
@@ -15600,7 +15600,7 @@
     </w:p>
     <w:p>
       <w:r>
-        <w:t>The boundary conclusion is unchanged — and is now better supported than my own argument</w:t>
+        <w:t>The boundary conclusion is unchanged - and is now better supported than my own argument</w:t>
       </w:r>
     </w:p>
     <w:p>
@@ -15891,7 +15891,7 @@
               <w:rPr>
                 <w:sz w:val="17"/>
               </w:rPr>
-              <w:t xml:space="preserve"> — </w:t>
+              <w:t xml:space="preserve"> - </w:t>
             </w:r>
             <w:r>
               <w:rPr>
@@ -15991,7 +15991,7 @@
               <w:rPr>
                 <w:sz w:val="17"/>
               </w:rPr>
-              <w:t xml:space="preserve"> — </w:t>
+              <w:t xml:space="preserve"> - </w:t>
             </w:r>
             <w:r>
               <w:rPr>
@@ -16056,7 +16056,7 @@
               <w:rPr>
                 <w:sz w:val="17"/>
               </w:rPr>
-              <w:t xml:space="preserve">FAIL — </w:t>
+              <w:t xml:space="preserve">FAIL - </w:t>
             </w:r>
             <w:r>
               <w:rPr>
@@ -16135,7 +16135,7 @@
               <w:rPr>
                 <w:sz w:val="17"/>
               </w:rPr>
-              <w:t xml:space="preserve">FAIL — </w:t>
+              <w:t xml:space="preserve">FAIL - </w:t>
             </w:r>
             <w:r>
               <w:rPr>
@@ -16208,7 +16208,7 @@
               <w:rPr>
                 <w:sz w:val="17"/>
               </w:rPr>
-              <w:t xml:space="preserve">FAIL — </w:t>
+              <w:t xml:space="preserve">FAIL - </w:t>
             </w:r>
             <w:r>
               <w:rPr>
@@ -16275,7 +16275,7 @@
     </w:p>
     <w:p>
       <w:r>
-        <w:t>expose what it *would* resolve — the registration keys and the paradigm dispatch table —</w:t>
+        <w:t>expose what it *would* resolve - the registration keys and the paradigm dispatch table -</w:t>
       </w:r>
     </w:p>
     <w:p>
@@ -16301,7 +16301,7 @@
         <w:pStyle w:val="Heading2"/>
       </w:pPr>
       <w:r>
-        <w:t>Second correction — posted 2026-08-28, after installing Ianvs and running it</w:t>
+        <w:t>Second correction - posted 2026-08-28, after installing Ianvs and running it</w:t>
       </w:r>
     </w:p>
     <w:p>
@@ -16336,7 +16336,7 @@
         <w:t>None</w:t>
       </w:r>
       <w:r>
-        <w:t xml:space="preserve"> — no exception, no log</w:t>
+        <w:t xml:space="preserve"> - no exception, no log</w:t>
       </w:r>
     </w:p>
     <w:p>
@@ -16602,7 +16602,7 @@
               <w:rPr>
                 <w:sz w:val="17"/>
               </w:rPr>
-              <w:t xml:space="preserve"> — the CLI exits 1, and </w:t>
+              <w:t xml:space="preserve"> - the CLI exits 1, and </w:t>
             </w:r>
             <w:r>
               <w:rPr>
@@ -16738,7 +16738,7 @@
                 <w:b/>
                 <w:sz w:val="17"/>
               </w:rPr>
-              <w:t>RETRACTED — Core validates it correctly and loudly</w:t>
+              <w:t>RETRACTED - Core validates it correctly and loudly</w:t>
             </w:r>
           </w:p>
         </w:tc>
@@ -16783,7 +16783,7 @@
     </w:p>
     <w:p>
       <w:r>
-        <w:t>to validate identifiers — Core validates them, with a good error message that even lists</w:t>
+        <w:t>to validate identifiers - Core validates them, with a good error message that even lists</w:t>
       </w:r>
     </w:p>
     <w:p>
@@ -16848,12 +16848,12 @@
     </w:p>
     <w:p>
       <w:r>
-        <w:t>also exactly Step 1 of my Task 3 repair strategy — have Core expose what it would resolve,</w:t>
-      </w:r>
-    </w:p>
-    <w:p>
-      <w:r>
-        <w:t>so the existing validator can consult it — which I can now say is a small change rather</w:t>
+        <w:t>also exactly Step 1 of my Task 3 repair strategy - have Core expose what it would resolve,</w:t>
+      </w:r>
+    </w:p>
+    <w:p>
+      <w:r>
+        <w:t>so the existing validator can consult it - which I can now say is a small change rather</w:t>
       </w:r>
     </w:p>
     <w:p>
@@ -16889,7 +16889,7 @@
     </w:p>
     <w:p>
       <w:r>
-        <w:t>declarations drift until something executes them — which turns out to apply to my</w:t>
+        <w:t>declarations drift until something executes them - which turns out to apply to my</w:t>
       </w:r>
     </w:p>
     <w:p>
@@ -16907,7 +16907,7 @@
         <w:pStyle w:val="Heading1"/>
       </w:pPr>
       <w:r>
-        <w:t>Task 4 — Restoration Path Design</w:t>
+        <w:t>Task 4 - Restoration Path Design</w:t>
       </w:r>
     </w:p>
     <w:p>
@@ -17075,7 +17075,7 @@
               <w:rPr>
                 <w:sz w:val="17"/>
               </w:rPr>
-              <w:t xml:space="preserve">#568 — </w:t>
+              <w:t xml:space="preserve">#568 - </w:t>
             </w:r>
             <w:r>
               <w:rPr>
@@ -17167,7 +17167,7 @@
               <w:rPr>
                 <w:sz w:val="17"/>
               </w:rPr>
-              <w:t xml:space="preserve">#641 — inert </w:t>
+              <w:t xml:space="preserve">#641 - inert </w:t>
             </w:r>
             <w:r>
               <w:rPr>
@@ -17772,7 +17772,7 @@
     </w:p>
     <w:p>
       <w:r>
-        <w:t xml:space="preserve">  behaviour and R4b's recoverability loss have nothing watching for them — which is</w:t>
+        <w:t xml:space="preserve">  behaviour and R4b's recoverability loss have nothing watching for them - which is</w:t>
       </w:r>
     </w:p>
     <w:p>
@@ -17941,7 +17941,7 @@
         <w:t>S3c</w:t>
       </w:r>
       <w:r>
-        <w:t xml:space="preserve"> — disjoint file</w:t>
+        <w:t xml:space="preserve"> - disjoint file</w:t>
       </w:r>
     </w:p>
     <w:p>
@@ -18763,7 +18763,7 @@
               <w:rPr>
                 <w:sz w:val="17"/>
               </w:rPr>
-              <w:t>none — merge it</w:t>
+              <w:t>none - merge it</w:t>
             </w:r>
           </w:p>
         </w:tc>
@@ -18857,7 +18857,7 @@
               <w:rPr>
                 <w:sz w:val="17"/>
               </w:rPr>
-              <w:t>none — merge as cleanup</w:t>
+              <w:t>none - merge as cleanup</w:t>
             </w:r>
           </w:p>
         </w:tc>
@@ -18951,7 +18951,7 @@
               <w:rPr>
                 <w:sz w:val="17"/>
               </w:rPr>
-              <w:t>none — merge as cleanup</w:t>
+              <w:t>none - merge as cleanup</w:t>
             </w:r>
           </w:p>
         </w:tc>
@@ -19299,7 +19299,7 @@
               <w:rPr>
                 <w:sz w:val="17"/>
               </w:rPr>
-              <w:t>—</w:t>
+              <w:t>-</w:t>
             </w:r>
           </w:p>
         </w:tc>
@@ -19459,7 +19459,7 @@
               <w:rPr>
                 <w:sz w:val="17"/>
               </w:rPr>
-              <w:t>—</w:t>
+              <w:t>-</w:t>
             </w:r>
           </w:p>
         </w:tc>
@@ -19531,7 +19531,7 @@
         <w:t>__name__</w:t>
       </w:r>
       <w:r>
-        <w:t xml:space="preserve"> breaks something not covered by S2 — for instance</w:t>
+        <w:t xml:space="preserve"> breaks something not covered by S2 - for instance</w:t>
       </w:r>
     </w:p>
     <w:p>
@@ -19635,7 +19635,7 @@
         <w:t>main</w:t>
       </w:r>
       <w:r>
-        <w:t xml:space="preserve"> semantics — collisions present but recoverability intact — which is a</w:t>
+        <w:t xml:space="preserve"> semantics - collisions present but recoverability intact - which is a</w:t>
       </w:r>
     </w:p>
     <w:p>
@@ -19836,7 +19836,7 @@
               <w:rPr>
                 <w:sz w:val="17"/>
               </w:rPr>
-              <w:t>Must precede S2 — S2 has nothing to call otherwise. Safe to land first precisely because it changes nothing</w:t>
+              <w:t>Must precede S2 - S2 has nothing to call otherwise. Safe to land first precisely because it changes nothing</w:t>
             </w:r>
           </w:p>
         </w:tc>
@@ -19901,7 +19901,7 @@
               <w:rPr>
                 <w:sz w:val="17"/>
               </w:rPr>
-              <w:t>Must precede S4 — it is S4's regression oracle. Also converts S5 from guesswork to a checklist</w:t>
+              <w:t>Must precede S4 - it is S4's regression oracle. Also converts S5 from guesswork to a checklist</w:t>
             </w:r>
           </w:p>
         </w:tc>
@@ -21042,7 +21042,7 @@
               <w:rPr>
                 <w:sz w:val="17"/>
               </w:rPr>
-              <w:t xml:space="preserve"> — pure function, reads config and parses source, imports nothing</w:t>
+              <w:t xml:space="preserve"> - pure function, reads config and parses source, imports nothing</w:t>
             </w:r>
           </w:p>
         </w:tc>
@@ -21626,7 +21626,7 @@
               <w:rPr>
                 <w:sz w:val="17"/>
               </w:rPr>
-              <w:t>no — dead code removed</w:t>
+              <w:t>no - dead code removed</w:t>
             </w:r>
           </w:p>
         </w:tc>
@@ -21704,7 +21704,7 @@
               <w:rPr>
                 <w:sz w:val="17"/>
               </w:rPr>
-              <w:t>no — CI-only</w:t>
+              <w:t>no - CI-only</w:t>
             </w:r>
           </w:p>
         </w:tc>
@@ -21978,7 +21978,7 @@
               <w:rPr>
                 <w:sz w:val="17"/>
               </w:rPr>
-              <w:t>no — returns to today's known state</w:t>
+              <w:t>no - returns to today's known state</w:t>
             </w:r>
           </w:p>
         </w:tc>
@@ -22043,7 +22043,7 @@
               <w:rPr>
                 <w:sz w:val="17"/>
               </w:rPr>
-              <w:t>no — each is independent</w:t>
+              <w:t>no - each is independent</w:t>
             </w:r>
           </w:p>
         </w:tc>
@@ -23237,12 +23237,12 @@
     </w:p>
     <w:p>
       <w:r>
-        <w:t>gates are cheap — the full G0–G5 sweep is static analysis plus four short subprocess</w:t>
-      </w:r>
-    </w:p>
-    <w:p>
-      <w:r>
-        <w:t>tests — so this is affordable per commit, not per release. Results are recorded in</w:t>
+        <w:t>gates are cheap - the full G0–G5 sweep is static analysis plus four short subprocess</w:t>
+      </w:r>
+    </w:p>
+    <w:p>
+      <w:r>
+        <w:t>tests - so this is affordable per commit, not per release. Results are recorded in</w:t>
       </w:r>
     </w:p>
     <w:p>
@@ -23284,7 +23284,7 @@
         <w:pStyle w:val="ListNumber"/>
       </w:pPr>
       <w:r>
-        <w:t xml:space="preserve">G3 green — S2 reports zero blocking findings across all 48 </w:t>
+        <w:t xml:space="preserve">G3 green - S2 reports zero blocking findings across all 48 </w:t>
       </w:r>
       <w:r>
         <w:rPr>
@@ -23302,7 +23302,7 @@
         <w:pStyle w:val="ListNumber"/>
       </w:pPr>
       <w:r>
-        <w:t>G4 and G5 green on the S4 branch — the loader fix no longer trades one silent wrong</w:t>
+        <w:t>G4 and G5 green on the S4 branch - the loader fix no longer trades one silent wrong</w:t>
       </w:r>
     </w:p>
     <w:p>
@@ -23322,7 +23322,7 @@
         <w:t>cloud-edge-collaborative-inference-for-llm</w:t>
       </w:r>
       <w:r>
-        <w:t xml:space="preserve"> imports cleanly (S3a) — verifiable</w:t>
+        <w:t xml:space="preserve"> imports cleanly (S3a) - verifiable</w:t>
       </w:r>
     </w:p>
     <w:p>
@@ -23377,7 +23377,7 @@
         <w:pStyle w:val="ListNumber"/>
       </w:pPr>
       <w:r>
-        <w:t>Each Example's documented command path matches what S2 resolves — docs and config</w:t>
+        <w:t>Each Example's documented command path matches what S2 resolves - docs and config</w:t>
       </w:r>
     </w:p>
     <w:p>
@@ -23499,7 +23499,7 @@
     </w:p>
     <w:p>
       <w:r>
-        <w:t>parallel work — the inverse of the natural priority. The justification is measured, not</w:t>
+        <w:t>parallel work - the inverse of the natural priority. The justification is measured, not</w:t>
       </w:r>
     </w:p>
     <w:p>
@@ -23530,7 +23530,7 @@
     </w:p>
     <w:p>
       <w:r>
-        <w:t xml:space="preserve">git refs**, not assertions about one tree — the same fixture executed against </w:t>
+        <w:t xml:space="preserve">git refs**, not assertions about one tree - the same fixture executed against </w:t>
       </w:r>
       <w:r>
         <w:rPr>
@@ -23608,7 +23608,7 @@
         <w:pStyle w:val="Heading2"/>
       </w:pPr>
       <w:r>
-        <w:t>Correction — posted 2026-08-28</w:t>
+        <w:t>Correction - posted 2026-08-28</w:t>
       </w:r>
     </w:p>
     <w:p>
@@ -23925,7 +23925,7 @@
               <w:rPr>
                 <w:sz w:val="17"/>
               </w:rPr>
-              <w:t>none — this is covered, and covered three times</w:t>
+              <w:t>none - this is covered, and covered three times</w:t>
             </w:r>
           </w:p>
         </w:tc>
@@ -24043,7 +24043,7 @@
               <w:rPr>
                 <w:sz w:val="17"/>
               </w:rPr>
-              <w:t>—</w:t>
+              <w:t>-</w:t>
             </w:r>
           </w:p>
         </w:tc>
@@ -24160,7 +24160,7 @@
         <w:t>Repository path references exist</w:t>
       </w:r>
       <w:r>
-        <w:t xml:space="preserve"> — the same</w:t>
+        <w:t xml:space="preserve"> - the same</w:t>
       </w:r>
     </w:p>
     <w:p>
@@ -24254,7 +24254,7 @@
     </w:p>
     <w:p>
       <w:r>
-        <w:t xml:space="preserve">execute — their </w:t>
+        <w:t xml:space="preserve">execute - their </w:t>
       </w:r>
       <w:r>
         <w:rPr>
@@ -24390,7 +24390,7 @@
         <w:pStyle w:val="Heading2"/>
       </w:pPr>
       <w:r>
-        <w:t>Second correction — posted 2026-08-28, after installing Ianvs and running it</w:t>
+        <w:t>Second correction - posted 2026-08-28, after installing Ianvs and running it</w:t>
       </w:r>
     </w:p>
     <w:p>
@@ -24425,7 +24425,7 @@
         <w:t>None</w:t>
       </w:r>
       <w:r>
-        <w:t xml:space="preserve"> — no exception, no log</w:t>
+        <w:t xml:space="preserve"> - no exception, no log</w:t>
       </w:r>
     </w:p>
     <w:p>
@@ -24691,7 +24691,7 @@
               <w:rPr>
                 <w:sz w:val="17"/>
               </w:rPr>
-              <w:t xml:space="preserve"> — the CLI exits 1, and </w:t>
+              <w:t xml:space="preserve"> - the CLI exits 1, and </w:t>
             </w:r>
             <w:r>
               <w:rPr>
@@ -24827,7 +24827,7 @@
                 <w:b/>
                 <w:sz w:val="17"/>
               </w:rPr>
-              <w:t>RETRACTED — Core validates it correctly and loudly</w:t>
+              <w:t>RETRACTED - Core validates it correctly and loudly</w:t>
             </w:r>
           </w:p>
         </w:tc>
@@ -24872,7 +24872,7 @@
     </w:p>
     <w:p>
       <w:r>
-        <w:t>to validate identifiers — Core validates them, with a good error message that even lists</w:t>
+        <w:t>to validate identifiers - Core validates them, with a good error message that even lists</w:t>
       </w:r>
     </w:p>
     <w:p>
@@ -24937,12 +24937,12 @@
     </w:p>
     <w:p>
       <w:r>
-        <w:t>also exactly Step 1 of my Task 3 repair strategy — have Core expose what it would resolve,</w:t>
-      </w:r>
-    </w:p>
-    <w:p>
-      <w:r>
-        <w:t>so the existing validator can consult it — which I can now say is a small change rather</w:t>
+        <w:t>also exactly Step 1 of my Task 3 repair strategy - have Core expose what it would resolve,</w:t>
+      </w:r>
+    </w:p>
+    <w:p>
+      <w:r>
+        <w:t>so the existing validator can consult it - which I can now say is a small change rather</w:t>
       </w:r>
     </w:p>
     <w:p>
@@ -24978,7 +24978,7 @@
     </w:p>
     <w:p>
       <w:r>
-        <w:t>declarations drift until something executes them — which turns out to apply to my</w:t>
+        <w:t>declarations drift until something executes them - which turns out to apply to my</w:t>
       </w:r>
     </w:p>
     <w:p>
@@ -24996,7 +24996,7 @@
         <w:pStyle w:val="Heading1"/>
       </w:pPr>
       <w:r>
-        <w:t>Bonus — Supplementary Review Coverage</w:t>
+        <w:t>Bonus - Supplementary Review Coverage</w:t>
       </w:r>
     </w:p>
     <w:p>
@@ -25297,7 +25297,7 @@
               <w:rPr>
                 <w:sz w:val="17"/>
               </w:rPr>
-              <w:t xml:space="preserve">Deletion is correct — and it makes permanent the fact that </w:t>
+              <w:t xml:space="preserve">Deletion is correct - and it makes permanent the fact that </w:t>
             </w:r>
             <w:r>
               <w:rPr>
@@ -25654,7 +25654,7 @@
               <w:rPr>
                 <w:sz w:val="17"/>
               </w:rPr>
-              <w:t>Correct — here is the proof of deadness the PR does not provide</w:t>
+              <w:t>Correct - here is the proof of deadness the PR does not provide</w:t>
             </w:r>
           </w:p>
         </w:tc>
@@ -25790,7 +25790,7 @@
         <w:pStyle w:val="Heading2"/>
       </w:pPr>
       <w:r>
-        <w:t>Cross-target finding — the same defect on a fifth contract surface</w:t>
+        <w:t>Cross-target finding - the same defect on a fifth contract surface</w:t>
       </w:r>
     </w:p>
     <w:p>
@@ -25849,7 +25849,7 @@
     </w:p>
     <w:p>
       <w:r>
-        <w:t>Core as unused. That is correct — but *why* they are unused is the interesting part:</w:t>
+        <w:t>Core as unused. That is correct - but *why* they are unused is the interesting part:</w:t>
       </w:r>
     </w:p>
     <w:p>
@@ -25942,7 +25942,7 @@
         <w:t>None</w:t>
       </w:r>
       <w:r>
-        <w:t xml:space="preserve"> — no exception, no log line, no validation at config-parse time.</w:t>
+        <w:t xml:space="preserve"> - no exception, no log line, no validation at config-parse time.</w:t>
       </w:r>
     </w:p>
     <w:p>
@@ -26015,7 +26015,7 @@
     </w:p>
     <w:p>
       <w:r>
-        <w:t xml:space="preserve">are therefore not merely un-run — they are </w:t>
+        <w:t xml:space="preserve">are therefore not merely un-run - they are </w:t>
       </w:r>
       <w:r>
         <w:rPr>
@@ -26045,7 +26045,7 @@
     </w:p>
     <w:p>
       <w:r>
-        <w:t>it should say what it is really doing — retiring two Examples — rather than describing it</w:t>
+        <w:t>it should say what it is really doing - retiring two Examples - rather than describing it</w:t>
       </w:r>
     </w:p>
     <w:p>
@@ -26099,7 +26099,7 @@
         <w:pStyle w:val="Heading3"/>
       </w:pPr>
       <w:r>
-        <w:t>#617 — `cleanup(core): remove unused paradigm files tightly coupled to examples`</w:t>
+        <w:t>#617 - `cleanup(core): remove unused paradigm files tightly coupled to examples`</w:t>
       </w:r>
     </w:p>
     <w:p>
@@ -26198,7 +26198,7 @@
         <w:t>core/</w:t>
       </w:r>
       <w:r>
-        <w:t xml:space="preserve"> — a layering inversion that alone justifies the removal.</w:t>
+        <w:t xml:space="preserve"> - a layering inversion that alone justifies the removal.</w:t>
       </w:r>
     </w:p>
     <w:p>
@@ -26222,7 +26222,7 @@
         <w:pStyle w:val="Heading3"/>
       </w:pPr>
       <w:r>
-        <w:t>#569 — `fix: remove undefined LadeSpecDecLLM import from edge_model`</w:t>
+        <w:t>#569 - `fix: remove undefined LadeSpecDecLLM import from edge_model`</w:t>
       </w:r>
     </w:p>
     <w:p>
@@ -26277,7 +26277,7 @@
         <w:t>uses</w:t>
       </w:r>
       <w:r>
-        <w:t>, zero definitions —</w:t>
+        <w:t>, zero definitions -</w:t>
       </w:r>
     </w:p>
     <w:p>
@@ -26374,7 +26374,7 @@
     </w:p>
     <w:p>
       <w:r>
-        <w:t>leaves the one that does not — which is exactly right as engineering triage, and exactly</w:t>
+        <w:t>leaves the one that does not - which is exactly right as engineering triage, and exactly</w:t>
       </w:r>
     </w:p>
     <w:p>
@@ -26400,7 +26400,7 @@
     </w:p>
     <w:p>
       <w:r>
-        <w:t>class was never implemented, deletion is defensible — but it diverges from the issue's</w:t>
+        <w:t>class was never implemented, deletion is defensible - but it diverges from the issue's</w:t>
       </w:r>
     </w:p>
     <w:p>
@@ -26416,7 +26416,7 @@
         <w:t>Recommendation: minor revision.</w:t>
       </w:r>
       <w:r>
-        <w:t xml:space="preserve"> No coding effort — a description note plus, ideally,</w:t>
+        <w:t xml:space="preserve"> No coding effort - a description note plus, ideally,</w:t>
       </w:r>
     </w:p>
     <w:p>
@@ -26439,7 +26439,7 @@
         <w:pStyle w:val="Heading3"/>
       </w:pPr>
       <w:r>
-        <w:t>#739 — `fix(examples): remove protobuf&lt;=3.20.3 pin conflicting with core onnx`</w:t>
+        <w:t>#739 - `fix(examples): remove protobuf&lt;=3.20.3 pin conflicting with core onnx`</w:t>
       </w:r>
     </w:p>
     <w:p>
@@ -26552,7 +26552,7 @@
     </w:p>
     <w:p>
       <w:r>
-        <w:t>select protobuf 3.x here — the very situation the PR exists to prevent. If the stated</w:t>
+        <w:t>select protobuf 3.x here - the very situation the PR exists to prevent. If the stated</w:t>
       </w:r>
     </w:p>
     <w:p>
@@ -26633,7 +26633,7 @@
         <w:t>Recommendation: minor revision</w:t>
       </w:r>
       <w:r>
-        <w:t xml:space="preserve"> — change one line to </w:t>
+        <w:t xml:space="preserve"> - change one line to </w:t>
       </w:r>
       <w:r>
         <w:rPr>
@@ -26651,7 +26651,7 @@
         <w:pStyle w:val="Heading3"/>
       </w:pPr>
       <w:r>
-        <w:t>#632 — `cleanup: remove dead code in JointInference.set_config()`</w:t>
+        <w:t>#632 - `cleanup: remove dead code in JointInference.set_config()`</w:t>
       </w:r>
     </w:p>
     <w:p>
@@ -26815,7 +26815,7 @@
         <w:t>else</w:t>
       </w:r>
       <w:r>
-        <w:t xml:space="preserve"> branch is therefore unreachable, and — because the original used </w:t>
+        <w:t xml:space="preserve"> branch is therefore unreachable, and - because the original used </w:t>
       </w:r>
       <w:r>
         <w:rPr>
@@ -26830,7 +26830,7 @@
     </w:p>
     <w:p>
       <w:r>
-        <w:t xml:space="preserve">than truthiness — an empty </w:t>
+        <w:t xml:space="preserve">than truthiness - an empty </w:t>
       </w:r>
       <w:r>
         <w:rPr>
@@ -26864,7 +26864,7 @@
         <w:pStyle w:val="Heading3"/>
       </w:pPr>
       <w:r>
-        <w:t>#540 — `fix(examples): add backwards-compatible fallback for transformers&gt;=5.0 in ViT/DeiT`</w:t>
+        <w:t>#540 - `fix(examples): add backwards-compatible fallback for transformers&gt;=5.0 in ViT/DeiT`</w:t>
       </w:r>
     </w:p>
     <w:p>
@@ -26987,7 +26987,7 @@
         <w:rPr>
           <w:b/>
         </w:rPr>
-        <w:t>Finding — silent substitution in a performance benchmark.</w:t>
+        <w:t>Finding - silent substitution in a performance benchmark.</w:t>
       </w:r>
       <w:r>
         <w:t xml:space="preserve"> The fallback emits no</w:t>
@@ -27022,7 +27022,7 @@
     </w:p>
     <w:p>
       <w:r>
-        <w:t>implementation rather than the library's — which is precisely what the benchmark exists</w:t>
+        <w:t>implementation rather than the library's - which is precisely what the benchmark exists</w:t>
       </w:r>
     </w:p>
     <w:p>
@@ -27673,7 +27673,7 @@
     </w:p>
     <w:p>
       <w:r>
-        <w:t>was executed end-to-end.** #540's fallback in particular is reviewed by reading — I did</w:t>
+        <w:t>was executed end-to-end.** #540's fallback in particular is reviewed by reading - I did</w:t>
       </w:r>
     </w:p>
     <w:p>
@@ -27724,7 +27724,7 @@
         <w:pStyle w:val="Heading2"/>
       </w:pPr>
       <w:r>
-        <w:t>Update — 2026-08-28: the `paradigm_type` gap, now executed</w:t>
+        <w:t>Update - 2026-08-28: the `paradigm_type` gap, now executed</w:t>
       </w:r>
     </w:p>
     <w:p>
@@ -27950,7 +27950,7 @@
     </w:p>
     <w:p>
       <w:r>
-        <w:t>removing unused files — nothing in CI will ever report their absence.</w:t>
+        <w:t>removing unused files - nothing in CI will ever report their absence.</w:t>
       </w:r>
     </w:p>
     <w:p>
@@ -27981,7 +27981,7 @@
         <w:pStyle w:val="Heading2"/>
       </w:pPr>
       <w:r>
-        <w:t>Second correction — posted 2026-08-28, after installing Ianvs and running it</w:t>
+        <w:t>Second correction - posted 2026-08-28, after installing Ianvs and running it</w:t>
       </w:r>
     </w:p>
     <w:p>
@@ -28016,7 +28016,7 @@
         <w:t>None</w:t>
       </w:r>
       <w:r>
-        <w:t xml:space="preserve"> — no exception, no log</w:t>
+        <w:t xml:space="preserve"> - no exception, no log</w:t>
       </w:r>
     </w:p>
     <w:p>
@@ -28282,7 +28282,7 @@
               <w:rPr>
                 <w:sz w:val="17"/>
               </w:rPr>
-              <w:t xml:space="preserve"> — the CLI exits 1, and </w:t>
+              <w:t xml:space="preserve"> - the CLI exits 1, and </w:t>
             </w:r>
             <w:r>
               <w:rPr>
@@ -28418,7 +28418,7 @@
                 <w:b/>
                 <w:sz w:val="17"/>
               </w:rPr>
-              <w:t>RETRACTED — Core validates it correctly and loudly</w:t>
+              <w:t>RETRACTED - Core validates it correctly and loudly</w:t>
             </w:r>
           </w:p>
         </w:tc>
@@ -28463,7 +28463,7 @@
     </w:p>
     <w:p>
       <w:r>
-        <w:t>to validate identifiers — Core validates them, with a good error message that even lists</w:t>
+        <w:t>to validate identifiers - Core validates them, with a good error message that even lists</w:t>
       </w:r>
     </w:p>
     <w:p>
@@ -28528,12 +28528,12 @@
     </w:p>
     <w:p>
       <w:r>
-        <w:t>also exactly Step 1 of my Task 3 repair strategy — have Core expose what it would resolve,</w:t>
-      </w:r>
-    </w:p>
-    <w:p>
-      <w:r>
-        <w:t>so the existing validator can consult it — which I can now say is a small change rather</w:t>
+        <w:t>also exactly Step 1 of my Task 3 repair strategy - have Core expose what it would resolve,</w:t>
+      </w:r>
+    </w:p>
+    <w:p>
+      <w:r>
+        <w:t>so the existing validator can consult it - which I can now say is a small change rather</w:t>
       </w:r>
     </w:p>
     <w:p>
@@ -28569,7 +28569,7 @@
     </w:p>
     <w:p>
       <w:r>
-        <w:t>declarations drift until something executes them — which turns out to apply to my</w:t>
+        <w:t>declarations drift until something executes them - which turns out to apply to my</w:t>
       </w:r>
     </w:p>
     <w:p>
@@ -28587,7 +28587,7 @@
         <w:pStyle w:val="Heading1"/>
       </w:pPr>
       <w:r>
-        <w:t>Appendix — target-specific comments as posted</w:t>
+        <w:t>Appendix - target-specific comments as posted</w:t>
       </w:r>
     </w:p>
     <w:p>
@@ -28640,7 +28640,7 @@
     </w:p>
     <w:p>
       <w:r>
-        <w:t>The identity fix is the right direction and it works — @Omkeswani27, @Yash4616 and</w:t>
+        <w:t>The identity fix is the right direction and it works - @Omkeswani27, @Yash4616 and</w:t>
       </w:r>
     </w:p>
     <w:p>
@@ -28752,7 +28752,7 @@
         <w:t>basemodel</w:t>
       </w:r>
       <w:r>
-        <w:t xml:space="preserve"> now loads correctly — the PR working as intended. But it</w:t>
+        <w:t xml:space="preserve"> now loads correctly - the PR working as intended. But it</w:t>
       </w:r>
     </w:p>
     <w:p>
@@ -28897,7 +28897,7 @@
         <w:t>python3 tools/probe_pr558_transitive.py ianvs</w:t>
       </w:r>
       <w:r>
-        <w:t xml:space="preserve"> —</w:t>
+        <w:t xml:space="preserve"> -</w:t>
       </w:r>
     </w:p>
     <w:p>
@@ -29069,7 +29069,7 @@
     </w:p>
     <w:p>
       <w:r>
-        <w:t>The md5 covers the *absolute* path, so it also differs per checkout directory — across</w:t>
+        <w:t>The md5 covers the *absolute* path, so it also differs per checkout directory - across</w:t>
       </w:r>
     </w:p>
     <w:p>
@@ -29378,7 +29378,7 @@
         <w:t>Major revision</w:t>
       </w:r>
       <w:r>
-        <w:t xml:space="preserve"> — for (1), which produces a wrong benchmark value. (2) is a release</w:t>
+        <w:t xml:space="preserve"> - for (1), which produces a wrong benchmark value. (2) is a release</w:t>
       </w:r>
     </w:p>
     <w:p>
@@ -29637,7 +29637,7 @@
         <w:t>python3 tools/probe_all_is_inert.py ianvs</w:t>
       </w:r>
       <w:r>
-        <w:t xml:space="preserve"> —</w:t>
+        <w:t xml:space="preserve"> -</w:t>
       </w:r>
     </w:p>
     <w:p>
@@ -29653,7 +29653,7 @@
         <w:t>Recommendation: minor revision</w:t>
       </w:r>
       <w:r>
-        <w:t xml:space="preserve"> — no code change needed; re-label and adjust the</w:t>
+        <w:t xml:space="preserve"> - no code change needed; re-label and adjust the</w:t>
       </w:r>
     </w:p>
     <w:p>
@@ -29701,7 +29701,7 @@
     </w:p>
     <w:p>
       <w:r>
-        <w:t xml:space="preserve">The change is correct — </w:t>
+        <w:t xml:space="preserve">The change is correct - </w:t>
       </w:r>
       <w:r>
         <w:rPr>
@@ -29831,7 +29831,7 @@
     </w:p>
     <w:p>
       <w:r>
-        <w:t>star-imports this module. Core resolves the class by ClassFactory alias —</w:t>
+        <w:t>star-imports this module. Core resolves the class by ClassFactory alias -</w:t>
       </w:r>
     </w:p>
     <w:p>
@@ -29855,7 +29855,7 @@
         <w:t>core/testcasecontroller/algorithm/module/module.py:116,130</w:t>
       </w:r>
       <w:r>
-        <w:t xml:space="preserve"> — which this module already</w:t>
+        <w:t xml:space="preserve"> - which this module already</w:t>
       </w:r>
     </w:p>
     <w:p>
@@ -29926,7 +29926,7 @@
     </w:p>
     <w:p>
       <w:r>
-        <w:t xml:space="preserve">example — </w:t>
+        <w:t xml:space="preserve">example - </w:t>
       </w:r>
       <w:r>
         <w:rPr>
@@ -29978,7 +29978,7 @@
         <w:t>python3 tools/probe_all_is_inert.py ianvs</w:t>
       </w:r>
       <w:r>
-        <w:t xml:space="preserve"> —</w:t>
+        <w:t xml:space="preserve"> -</w:t>
       </w:r>
     </w:p>
     <w:p>
@@ -29994,7 +29994,7 @@
         <w:t>Recommendation: minor revision</w:t>
       </w:r>
       <w:r>
-        <w:t xml:space="preserve"> — description and label only.</w:t>
+        <w:t xml:space="preserve"> - description and label only.</w:t>
       </w:r>
     </w:p>
     <w:p>
@@ -30220,7 +30220,7 @@
     </w:p>
     <w:p>
       <w:r>
-        <w:t>this commit — the function that would drop them is unreachable.</w:t>
+        <w:t>this commit - the function that would drop them is unreachable.</w:t>
       </w:r>
     </w:p>
     <w:p>
@@ -30281,7 +30281,7 @@
         <w:t>python3 tools/probe_parse_kwargs_dead.py ianvs</w:t>
       </w:r>
       <w:r>
-        <w:t xml:space="preserve"> —</w:t>
+        <w:t xml:space="preserve"> -</w:t>
       </w:r>
     </w:p>
     <w:p>
@@ -30297,7 +30297,7 @@
         <w:t>Recommendation: minor revision</w:t>
       </w:r>
       <w:r>
-        <w:t xml:space="preserve"> — description only, no coding effort.</w:t>
+        <w:t xml:space="preserve"> - description only, no coding effort.</w:t>
       </w:r>
     </w:p>
     <w:p>
@@ -30340,7 +30340,7 @@
     </w:p>
     <w:p>
       <w:r>
-        <w:t>Thanks for the quick turnaround, and the unit tests are a real improvement — they are the</w:t>
+        <w:t>Thanks for the quick turnaround, and the unit tests are a real improvement - they are the</w:t>
       </w:r>
     </w:p>
     <w:p>
@@ -30529,7 +30529,7 @@
     </w:p>
     <w:p>
       <w:r>
-        <w:t xml:space="preserve">to tolerate odd inputs — but </w:t>
+        <w:t xml:space="preserve">to tolerate odd inputs - but </w:t>
       </w:r>
       <w:r>
         <w:rPr>
@@ -30617,12 +30617,12 @@
         <w:t>kwargs</w:t>
       </w:r>
       <w:r>
-        <w:t xml:space="preserve"> unchanged — matching the</w:t>
-      </w:r>
-    </w:p>
-    <w:p>
-      <w:r>
-        <w:t>existing non-callable branch — would make both cases behave consistently and is about</w:t>
+        <w:t xml:space="preserve"> unchanged - matching the</w:t>
+      </w:r>
+    </w:p>
+    <w:p>
+      <w:r>
+        <w:t>existing non-callable branch - would make both cases behave consistently and is about</w:t>
       </w:r>
     </w:p>
     <w:p>
@@ -30723,7 +30723,7 @@
     </w:p>
     <w:p>
       <w:r>
-        <w:t>That change is because of @31groot's finding plus the two above — my earlier "no coding</w:t>
+        <w:t>That change is because of @31groot's finding plus the two above - my earlier "no coding</w:t>
       </w:r>
     </w:p>
     <w:p>
@@ -30936,7 +30936,7 @@
     </w:p>
     <w:p>
       <w:r>
-        <w:t>The defect itself is real — running the current helper gives</w:t>
+        <w:t>The defect itself is real - running the current helper gives</w:t>
       </w:r>
     </w:p>
     <w:p>
@@ -30948,7 +30948,7 @@
         <w:t>parse_kwargs(kwonly, threshold=0.9) -&gt; {}</w:t>
       </w:r>
       <w:r>
-        <w:t xml:space="preserve"> — so neither PR is wrong. It is a question of</w:t>
+        <w:t xml:space="preserve"> - so neither PR is wrong. It is a question of</w:t>
       </w:r>
     </w:p>
     <w:p>
@@ -30968,7 +30968,7 @@
         <w:t>python3 tools/probe_parse_kwargs_dead.py ianvs</w:t>
       </w:r>
       <w:r>
-        <w:t xml:space="preserve"> —</w:t>
+        <w:t xml:space="preserve"> -</w:t>
       </w:r>
     </w:p>
     <w:p>
@@ -30989,7 +30989,7 @@
     </w:p>
     <w:p>
       <w:r>
-        <w:t>of #598 and move the unit test there — the test is the part of this PR #598 lacks, and it</w:t>
+        <w:t>of #598 and move the unit test there - the test is the part of this PR #598 lacks, and it</w:t>
       </w:r>
     </w:p>
     <w:p>
@@ -31281,7 +31281,7 @@
         <w:t>None</w:t>
       </w:r>
       <w:r>
-        <w:t xml:space="preserve"> — no exception, no warning, no validation at</w:t>
+        <w:t xml:space="preserve"> - no exception, no warning, no validation at</w:t>
       </w:r>
     </w:p>
     <w:p>
@@ -31380,7 +31380,7 @@
         <w:t>paradigm_type</w:t>
       </w:r>
       <w:r>
-        <w:t xml:space="preserve"> fails this way — silently, with </w:t>
+        <w:t xml:space="preserve"> fails this way - silently, with </w:t>
       </w:r>
       <w:r>
         <w:rPr>
@@ -31444,7 +31444,7 @@
     </w:p>
     <w:p>
       <w:r>
-        <w:t xml:space="preserve">Follow-up to my earlier review: the claim I made statically — that the two </w:t>
+        <w:t xml:space="preserve">Follow-up to my earlier review: the claim I made statically - that the two </w:t>
       </w:r>
       <w:r>
         <w:rPr>
@@ -31456,7 +31456,7 @@
     </w:p>
     <w:p>
       <w:r>
-        <w:t>Examples this PR retires are unrunnable and that nothing reports it — is now executed.</w:t>
+        <w:t>Examples this PR retires are unrunnable and that nothing reports it - is now executed.</w:t>
       </w:r>
     </w:p>
     <w:p>
@@ -31661,7 +31661,7 @@
         <w:t>else</w:t>
       </w:r>
       <w:r>
-        <w:t xml:space="preserve"> — so the call returns</w:t>
+        <w:t xml:space="preserve"> - so the call returns</w:t>
       </w:r>
     </w:p>
     <w:p>
@@ -31772,7 +31772,7 @@
     </w:p>
     <w:p>
       <w:r>
-        <w:t xml:space="preserve">This does not change my recommendation — </w:t>
+        <w:t xml:space="preserve">This does not change my recommendation - </w:t>
       </w:r>
       <w:r>
         <w:rPr>
@@ -31826,7 +31826,7 @@
     </w:p>
     <w:p>
       <w:r>
-        <w:t xml:space="preserve">outcomes is intended — restore the </w:t>
+        <w:t xml:space="preserve">outcomes is intended - restore the </w:t>
       </w:r>
       <w:r>
         <w:rPr>
@@ -31841,7 +31841,7 @@
     </w:p>
     <w:p>
       <w:r>
-        <w:t>their READMEs — would be enough.</w:t>
+        <w:t>their READMEs - would be enough.</w:t>
       </w:r>
     </w:p>
     <w:p>
@@ -31856,7 +31856,7 @@
         <w:t>python3 tools/run_shipped_validator.py ianvs</w:t>
       </w:r>
       <w:r>
-        <w:t xml:space="preserve"> —</w:t>
+        <w:t xml:space="preserve"> -</w:t>
       </w:r>
     </w:p>
     <w:p>
@@ -31904,7 +31904,7 @@
         <w:t>else</w:t>
       </w:r>
       <w:r>
-        <w:t xml:space="preserve"> — so the call returns</w:t>
+        <w:t xml:space="preserve"> - so the call returns</w:t>
       </w:r>
     </w:p>
     <w:p>
@@ -32164,7 +32164,7 @@
               <w:rPr>
                 <w:sz w:val="17"/>
               </w:rPr>
-              <w:t xml:space="preserve"> — CLI exits 1; </w:t>
+              <w:t xml:space="preserve"> - CLI exits 1; </w:t>
             </w:r>
             <w:r>
               <w:rPr>
@@ -32300,7 +32300,7 @@
                 <w:b/>
                 <w:sz w:val="17"/>
               </w:rPr>
-              <w:t>retracted — Core validates it correctly, and the error message even lists the valid values</w:t>
+              <w:t>retracted - Core validates it correctly, and the error message even lists the valid values</w:t>
             </w:r>
           </w:p>
         </w:tc>
@@ -32335,7 +32335,7 @@
     </w:p>
     <w:p>
       <w:r>
-        <w:t>nothing would report these Examples as broken — Core reports them clearly the moment</w:t>
+        <w:t>nothing would report these Examples as broken - Core reports them clearly the moment</w:t>
       </w:r>
     </w:p>
     <w:p>
@@ -32388,7 +32388,7 @@
         <w:t>yaoba</w:t>
       </w:r>
       <w:r>
-        <w:t xml:space="preserve"> Examples are being retired deliberately would still help — CI will keep saying</w:t>
+        <w:t xml:space="preserve"> Examples are being retired deliberately would still help - CI will keep saying</w:t>
       </w:r>
     </w:p>
     <w:p>
@@ -32418,7 +32418,7 @@
         <w:t>python3 tools/probe_paradigm_runtime.py ianvs</w:t>
       </w:r>
       <w:r>
-        <w:t xml:space="preserve"> —</w:t>
+        <w:t xml:space="preserve"> -</w:t>
       </w:r>
     </w:p>
     <w:p>
@@ -32482,7 +32482,7 @@
         <w:t>LadeSpecDecLLM</w:t>
       </w:r>
       <w:r>
-        <w:t xml:space="preserve"> appears exactly twice in the repository — </w:t>
+        <w:t xml:space="preserve"> appears exactly twice in the repository - </w:t>
       </w:r>
       <w:r>
         <w:rPr>
@@ -32504,7 +32504,7 @@
         <w:t>:77</w:t>
       </w:r>
       <w:r>
-        <w:t xml:space="preserve"> — both uses, zero definitions, and</w:t>
+        <w:t xml:space="preserve"> - both uses, zero definitions, and</w:t>
       </w:r>
     </w:p>
     <w:p>
@@ -32623,7 +32623,7 @@
         <w:t>backend: values:</w:t>
       </w:r>
       <w:r>
-        <w:t xml:space="preserve"> — the list is </w:t>
+        <w:t xml:space="preserve"> - the list is </w:t>
       </w:r>
       <w:r>
         <w:rPr>
@@ -32655,7 +32655,7 @@
         <w:t># - "EagleSpecDec"</w:t>
       </w:r>
       <w:r>
-        <w:t xml:space="preserve"> commented out — so the deleted branch was unreachable from any</w:t>
+        <w:t xml:space="preserve"> commented out - so the deleted branch was unreachable from any</w:t>
       </w:r>
     </w:p>
     <w:p>
@@ -32708,7 +32708,7 @@
         <w:t>__all__</w:t>
       </w:r>
       <w:r>
-        <w:t xml:space="preserve"> has no runtime effect here — nothing star-imports this module and </w:t>
+        <w:t xml:space="preserve"> has no runtime effect here - nothing star-imports this module and </w:t>
       </w:r>
       <w:r>
         <w:rPr>
@@ -32773,7 +32773,7 @@
     </w:p>
     <w:p>
       <w:r>
-        <w:t>deletion looks like the right call — but the divergence should be noted in the PR</w:t>
+        <w:t>deletion looks like the right call - but the divergence should be noted in the PR</w:t>
       </w:r>
     </w:p>
     <w:p>
@@ -32789,7 +32789,7 @@
         <w:t>Recommendation: minor revision</w:t>
       </w:r>
       <w:r>
-        <w:t xml:space="preserve"> — description note, and optionally the one-line</w:t>
+        <w:t xml:space="preserve"> - description note, and optionally the one-line</w:t>
       </w:r>
     </w:p>
     <w:p>
@@ -32839,7 +32839,7 @@
         <w:t>37a9c60</w:t>
       </w:r>
       <w:r>
-        <w:t>. The direction is right — a</w:t>
+        <w:t>. The direction is right - a</w:t>
       </w:r>
     </w:p>
     <w:p>
@@ -32902,7 +32902,7 @@
     </w:p>
     <w:p>
       <w:r>
-        <w:t xml:space="preserve">protobuf 3.x — the situation this PR exists to prevent. If </w:t>
+        <w:t xml:space="preserve">protobuf 3.x - the situation this PR exists to prevent. If </w:t>
       </w:r>
       <w:r>
         <w:rPr>
@@ -33020,7 +33020,7 @@
     </w:p>
     <w:p>
       <w:r>
-        <w:t xml:space="preserve">right — no </w:t>
+        <w:t xml:space="preserve">right - no </w:t>
       </w:r>
       <w:r>
         <w:rPr>
@@ -33071,7 +33071,7 @@
         <w:t>Recommendation: minor revision</w:t>
       </w:r>
       <w:r>
-        <w:t xml:space="preserve"> — change </w:t>
+        <w:t xml:space="preserve"> - change </w:t>
       </w:r>
       <w:r>
         <w:rPr>
@@ -33129,7 +33129,7 @@
         <w:t>37a9c60</w:t>
       </w:r>
       <w:r>
-        <w:t>. The change is correct — but the PR asserts</w:t>
+        <w:t>. The change is correct - but the PR asserts</w:t>
       </w:r>
     </w:p>
     <w:p>
@@ -33298,7 +33298,7 @@
         <w:t>NotImplementedError</w:t>
       </w:r>
       <w:r>
-        <w:t xml:space="preserve"> if none is present — so the object is</w:t>
+        <w:t xml:space="preserve"> if none is present - so the object is</w:t>
       </w:r>
     </w:p>
     <w:p>
@@ -33449,7 +33449,7 @@
     </w:p>
     <w:p>
       <w:r>
-        <w:t xml:space="preserve">would merge this — </w:t>
+        <w:t xml:space="preserve">would merge this - </w:t>
       </w:r>
       <w:r>
         <w:rPr>
@@ -33586,7 +33586,7 @@
     </w:p>
     <w:p>
       <w:r>
-        <w:t>emits nothing — no warning, no log line, no record in the benchmark output. A user on</w:t>
+        <w:t>emits nothing - no warning, no log line, no record in the benchmark output. A user on</w:t>
       </w:r>
     </w:p>
     <w:p>
@@ -33784,7 +33784,7 @@
         <w:t>Recommendation: minor revision</w:t>
       </w:r>
       <w:r>
-        <w:t xml:space="preserve"> — add the warning; the rest is fine.</w:t>
+        <w:t xml:space="preserve"> - add the warning; the rest is fine.</w:t>
       </w:r>
     </w:p>
     <w:p>
@@ -34509,7 +34509,7 @@
         <w:t>python3 tools/probe_parse_kwargs_dead.py ianvs</w:t>
       </w:r>
       <w:r>
-        <w:t xml:space="preserve"> —</w:t>
+        <w:t xml:space="preserve"> -</w:t>
       </w:r>
     </w:p>
     <w:p>
@@ -34699,7 +34699,7 @@
     </w:p>
     <w:p>
       <w:r>
-        <w:t>Core resolves the class through the ClassFactory alias instead —</w:t>
+        <w:t>Core resolves the class through the ClassFactory alias instead -</w:t>
       </w:r>
     </w:p>
     <w:p>
@@ -34723,7 +34723,7 @@
         <w:t>core/testcasecontroller/metrics/metrics.py:173</w:t>
       </w:r>
       <w:r>
-        <w:t xml:space="preserve"> — and this module registers correctly.</w:t>
+        <w:t xml:space="preserve"> - and this module registers correctly.</w:t>
       </w:r>
     </w:p>
     <w:p>
@@ -34829,12 +34829,12 @@
         <w:t>__all__ = ('name')</w:t>
       </w:r>
       <w:r>
-        <w:t xml:space="preserve"> — parentheses without a comma, so a</w:t>
-      </w:r>
-    </w:p>
-    <w:p>
-      <w:r>
-        <w:t>string rather than a tuple — in 18 metric modules. None of the 30 is load-bearing.</w:t>
+        <w:t xml:space="preserve"> - parentheses without a comma, so a</w:t>
+      </w:r>
+    </w:p>
+    <w:p>
+      <w:r>
+        <w:t>string rather than a tuple - in 18 metric modules. None of the 30 is load-bearing.</w:t>
       </w:r>
     </w:p>
     <w:p>
@@ -34925,7 +34925,7 @@
         <w:t>python3 tools/probe_all_is_inert.py ianvs</w:t>
       </w:r>
       <w:r>
-        <w:t xml:space="preserve"> —</w:t>
+        <w:t xml:space="preserve"> -</w:t>
       </w:r>
     </w:p>
     <w:p>
@@ -35077,7 +35077,7 @@
     </w:p>
     <w:p>
       <w:r>
-        <w:t>module cannot be loaded at all — before any dataset, model download or API key is</w:t>
+        <w:t>module cannot be loaded at all - before any dataset, model download or API key is</w:t>
       </w:r>
     </w:p>
     <w:p>

</xml_diff>